<commit_message>
docs: update project documentation
</commit_message>
<xml_diff>
--- a/docs/phase 2/Anforderungsdokument.docx
+++ b/docs/phase 2/Anforderungsdokument.docx
@@ -298,19 +298,19 @@
         <w:rPr>
           <w:rFonts w:cs="Arial"/>
         </w:rPr>
-        <w:t>27</w:t>
+        <w:t>xx</w:t>
       </w:r>
       <w:r>
         <w:rPr>
           <w:rFonts w:cs="Arial"/>
         </w:rPr>
-        <w:t>.0</w:t>
+        <w:t>.</w:t>
       </w:r>
       <w:r>
         <w:rPr>
           <w:rFonts w:cs="Arial"/>
         </w:rPr>
-        <w:t>9</w:t>
+        <w:t>10</w:t>
       </w:r>
       <w:r>
         <w:rPr>
@@ -416,7 +416,7 @@
             </w:rPr>
             <w:fldChar w:fldCharType="separate"/>
           </w:r>
-          <w:hyperlink w:anchor="_Toc241412971" w:history="1">
+          <w:hyperlink w:anchor="_Toc243653409" w:history="1">
             <w:r>
               <w:rPr>
                 <w:rStyle w:val="Hyperlink"/>
@@ -443,7 +443,7 @@
                 <w:noProof/>
                 <w:webHidden/>
               </w:rPr>
-              <w:instrText xml:space="preserve"> PAGEREF _Toc241412971 \h </w:instrText>
+              <w:instrText xml:space="preserve"> PAGEREF _Toc243653409 \h </w:instrText>
             </w:r>
             <w:r>
               <w:rPr>
@@ -485,7 +485,7 @@
               <w:lang w:eastAsia="de-DE"/>
             </w:rPr>
           </w:pPr>
-          <w:hyperlink w:anchor="_Toc241412972" w:history="1">
+          <w:hyperlink w:anchor="_Toc243653410" w:history="1">
             <w:r>
               <w:rPr>
                 <w:rStyle w:val="Hyperlink"/>
@@ -513,7 +513,7 @@
                 <w:noProof/>
                 <w:webHidden/>
               </w:rPr>
-              <w:instrText xml:space="preserve"> PAGEREF _Toc241412972 \h </w:instrText>
+              <w:instrText xml:space="preserve"> PAGEREF _Toc243653410 \h </w:instrText>
             </w:r>
             <w:r>
               <w:rPr>
@@ -555,7 +555,7 @@
               <w:lang w:eastAsia="de-DE"/>
             </w:rPr>
           </w:pPr>
-          <w:hyperlink w:anchor="_Toc241412973" w:history="1">
+          <w:hyperlink w:anchor="_Toc243653411" w:history="1">
             <w:r>
               <w:rPr>
                 <w:rStyle w:val="Hyperlink"/>
@@ -583,7 +583,7 @@
                 <w:noProof/>
                 <w:webHidden/>
               </w:rPr>
-              <w:instrText xml:space="preserve"> PAGEREF _Toc241412973 \h </w:instrText>
+              <w:instrText xml:space="preserve"> PAGEREF _Toc243653411 \h </w:instrText>
             </w:r>
             <w:r>
               <w:rPr>
@@ -625,7 +625,7 @@
               <w:lang w:eastAsia="de-DE"/>
             </w:rPr>
           </w:pPr>
-          <w:hyperlink w:anchor="_Toc241412974" w:history="1">
+          <w:hyperlink w:anchor="_Toc243653412" w:history="1">
             <w:r>
               <w:rPr>
                 <w:rStyle w:val="Hyperlink"/>
@@ -652,7 +652,7 @@
                 <w:noProof/>
                 <w:webHidden/>
               </w:rPr>
-              <w:instrText xml:space="preserve"> PAGEREF _Toc241412974 \h </w:instrText>
+              <w:instrText xml:space="preserve"> PAGEREF _Toc243653412 \h </w:instrText>
             </w:r>
             <w:r>
               <w:rPr>
@@ -694,7 +694,7 @@
               <w:lang w:eastAsia="de-DE"/>
             </w:rPr>
           </w:pPr>
-          <w:hyperlink w:anchor="_Toc241412975" w:history="1">
+          <w:hyperlink w:anchor="_Toc243653413" w:history="1">
             <w:r>
               <w:rPr>
                 <w:rStyle w:val="Hyperlink"/>
@@ -722,7 +722,7 @@
                 <w:noProof/>
                 <w:webHidden/>
               </w:rPr>
-              <w:instrText xml:space="preserve"> PAGEREF _Toc241412975 \h </w:instrText>
+              <w:instrText xml:space="preserve"> PAGEREF _Toc243653413 \h </w:instrText>
             </w:r>
             <w:r>
               <w:rPr>
@@ -767,7 +767,7 @@
               <w:lang w:eastAsia="de-DE"/>
             </w:rPr>
           </w:pPr>
-          <w:hyperlink w:anchor="_Toc241412976" w:history="1">
+          <w:hyperlink w:anchor="_Toc243653414" w:history="1">
             <w:r>
               <w:rPr>
                 <w:rStyle w:val="Hyperlink"/>
@@ -794,7 +794,7 @@
                 <w:noProof/>
                 <w:webHidden/>
               </w:rPr>
-              <w:instrText xml:space="preserve"> PAGEREF _Toc241412976 \h </w:instrText>
+              <w:instrText xml:space="preserve"> PAGEREF _Toc243653414 \h </w:instrText>
             </w:r>
             <w:r>
               <w:rPr>
@@ -839,7 +839,7 @@
               <w:lang w:eastAsia="de-DE"/>
             </w:rPr>
           </w:pPr>
-          <w:hyperlink w:anchor="_Toc241412977" w:history="1">
+          <w:hyperlink w:anchor="_Toc243653415" w:history="1">
             <w:r>
               <w:rPr>
                 <w:rStyle w:val="Hyperlink"/>
@@ -866,7 +866,7 @@
                 <w:noProof/>
                 <w:webHidden/>
               </w:rPr>
-              <w:instrText xml:space="preserve"> PAGEREF _Toc241412977 \h </w:instrText>
+              <w:instrText xml:space="preserve"> PAGEREF _Toc243653415 \h </w:instrText>
             </w:r>
             <w:r>
               <w:rPr>
@@ -911,7 +911,7 @@
               <w:lang w:eastAsia="de-DE"/>
             </w:rPr>
           </w:pPr>
-          <w:hyperlink w:anchor="_Toc241412978" w:history="1">
+          <w:hyperlink w:anchor="_Toc243653416" w:history="1">
             <w:r>
               <w:rPr>
                 <w:rStyle w:val="Hyperlink"/>
@@ -938,7 +938,7 @@
                 <w:noProof/>
                 <w:webHidden/>
               </w:rPr>
-              <w:instrText xml:space="preserve"> PAGEREF _Toc241412978 \h </w:instrText>
+              <w:instrText xml:space="preserve"> PAGEREF _Toc243653416 \h </w:instrText>
             </w:r>
             <w:r>
               <w:rPr>
@@ -980,7 +980,7 @@
               <w:lang w:eastAsia="de-DE"/>
             </w:rPr>
           </w:pPr>
-          <w:hyperlink w:anchor="_Toc241412979" w:history="1">
+          <w:hyperlink w:anchor="_Toc243653417" w:history="1">
             <w:r>
               <w:rPr>
                 <w:rStyle w:val="Hyperlink"/>
@@ -1008,7 +1008,7 @@
                 <w:noProof/>
                 <w:webHidden/>
               </w:rPr>
-              <w:instrText xml:space="preserve"> PAGEREF _Toc241412979 \h </w:instrText>
+              <w:instrText xml:space="preserve"> PAGEREF _Toc243653417 \h </w:instrText>
             </w:r>
             <w:r>
               <w:rPr>
@@ -1053,7 +1053,7 @@
               <w:lang w:eastAsia="de-DE"/>
             </w:rPr>
           </w:pPr>
-          <w:hyperlink w:anchor="_Toc241412980" w:history="1">
+          <w:hyperlink w:anchor="_Toc243653418" w:history="1">
             <w:r>
               <w:rPr>
                 <w:rStyle w:val="Hyperlink"/>
@@ -1080,7 +1080,7 @@
                 <w:noProof/>
                 <w:webHidden/>
               </w:rPr>
-              <w:instrText xml:space="preserve"> PAGEREF _Toc241412980 \h </w:instrText>
+              <w:instrText xml:space="preserve"> PAGEREF _Toc243653418 \h </w:instrText>
             </w:r>
             <w:r>
               <w:rPr>
@@ -1125,7 +1125,7 @@
               <w:lang w:eastAsia="de-DE"/>
             </w:rPr>
           </w:pPr>
-          <w:hyperlink w:anchor="_Toc241412981" w:history="1">
+          <w:hyperlink w:anchor="_Toc243653419" w:history="1">
             <w:r>
               <w:rPr>
                 <w:rStyle w:val="Hyperlink"/>
@@ -1152,7 +1152,7 @@
                 <w:noProof/>
                 <w:webHidden/>
               </w:rPr>
-              <w:instrText xml:space="preserve"> PAGEREF _Toc241412981 \h </w:instrText>
+              <w:instrText xml:space="preserve"> PAGEREF _Toc243653419 \h </w:instrText>
             </w:r>
             <w:r>
               <w:rPr>
@@ -1197,7 +1197,7 @@
               <w:lang w:eastAsia="de-DE"/>
             </w:rPr>
           </w:pPr>
-          <w:hyperlink w:anchor="_Toc241412982" w:history="1">
+          <w:hyperlink w:anchor="_Toc243653420" w:history="1">
             <w:r>
               <w:rPr>
                 <w:rStyle w:val="Hyperlink"/>
@@ -1224,7 +1224,7 @@
                 <w:noProof/>
                 <w:webHidden/>
               </w:rPr>
-              <w:instrText xml:space="preserve"> PAGEREF _Toc241412982 \h </w:instrText>
+              <w:instrText xml:space="preserve"> PAGEREF _Toc243653420 \h </w:instrText>
             </w:r>
             <w:r>
               <w:rPr>
@@ -1269,7 +1269,7 @@
               <w:lang w:eastAsia="de-DE"/>
             </w:rPr>
           </w:pPr>
-          <w:hyperlink w:anchor="_Toc241412983" w:history="1">
+          <w:hyperlink w:anchor="_Toc243653421" w:history="1">
             <w:r>
               <w:rPr>
                 <w:rStyle w:val="Hyperlink"/>
@@ -1296,7 +1296,7 @@
                 <w:noProof/>
                 <w:webHidden/>
               </w:rPr>
-              <w:instrText xml:space="preserve"> PAGEREF _Toc241412983 \h </w:instrText>
+              <w:instrText xml:space="preserve"> PAGEREF _Toc243653421 \h </w:instrText>
             </w:r>
             <w:r>
               <w:rPr>
@@ -1341,7 +1341,7 @@
               <w:lang w:eastAsia="de-DE"/>
             </w:rPr>
           </w:pPr>
-          <w:hyperlink w:anchor="_Toc241412984" w:history="1">
+          <w:hyperlink w:anchor="_Toc243653422" w:history="1">
             <w:r>
               <w:rPr>
                 <w:rStyle w:val="Hyperlink"/>
@@ -1368,7 +1368,7 @@
                 <w:noProof/>
                 <w:webHidden/>
               </w:rPr>
-              <w:instrText xml:space="preserve"> PAGEREF _Toc241412984 \h </w:instrText>
+              <w:instrText xml:space="preserve"> PAGEREF _Toc243653422 \h </w:instrText>
             </w:r>
             <w:r>
               <w:rPr>
@@ -1413,7 +1413,7 @@
               <w:lang w:eastAsia="de-DE"/>
             </w:rPr>
           </w:pPr>
-          <w:hyperlink w:anchor="_Toc241412985" w:history="1">
+          <w:hyperlink w:anchor="_Toc243653423" w:history="1">
             <w:r>
               <w:rPr>
                 <w:rStyle w:val="Hyperlink"/>
@@ -1440,7 +1440,7 @@
                 <w:noProof/>
                 <w:webHidden/>
               </w:rPr>
-              <w:instrText xml:space="preserve"> PAGEREF _Toc241412985 \h </w:instrText>
+              <w:instrText xml:space="preserve"> PAGEREF _Toc243653423 \h </w:instrText>
             </w:r>
             <w:r>
               <w:rPr>
@@ -1485,7 +1485,7 @@
               <w:lang w:eastAsia="de-DE"/>
             </w:rPr>
           </w:pPr>
-          <w:hyperlink w:anchor="_Toc241412986" w:history="1">
+          <w:hyperlink w:anchor="_Toc243653424" w:history="1">
             <w:r>
               <w:rPr>
                 <w:rStyle w:val="Hyperlink"/>
@@ -1512,7 +1512,7 @@
                 <w:noProof/>
                 <w:webHidden/>
               </w:rPr>
-              <w:instrText xml:space="preserve"> PAGEREF _Toc241412986 \h </w:instrText>
+              <w:instrText xml:space="preserve"> PAGEREF _Toc243653424 \h </w:instrText>
             </w:r>
             <w:r>
               <w:rPr>
@@ -1557,7 +1557,7 @@
               <w:lang w:eastAsia="de-DE"/>
             </w:rPr>
           </w:pPr>
-          <w:hyperlink w:anchor="_Toc241412987" w:history="1">
+          <w:hyperlink w:anchor="_Toc243653425" w:history="1">
             <w:r>
               <w:rPr>
                 <w:rStyle w:val="Hyperlink"/>
@@ -1584,7 +1584,7 @@
                 <w:noProof/>
                 <w:webHidden/>
               </w:rPr>
-              <w:instrText xml:space="preserve"> PAGEREF _Toc241412987 \h </w:instrText>
+              <w:instrText xml:space="preserve"> PAGEREF _Toc243653425 \h </w:instrText>
             </w:r>
             <w:r>
               <w:rPr>
@@ -1629,7 +1629,7 @@
               <w:lang w:eastAsia="de-DE"/>
             </w:rPr>
           </w:pPr>
-          <w:hyperlink w:anchor="_Toc241412988" w:history="1">
+          <w:hyperlink w:anchor="_Toc243653426" w:history="1">
             <w:r>
               <w:rPr>
                 <w:rStyle w:val="Hyperlink"/>
@@ -1656,7 +1656,7 @@
                 <w:noProof/>
                 <w:webHidden/>
               </w:rPr>
-              <w:instrText xml:space="preserve"> PAGEREF _Toc241412988 \h </w:instrText>
+              <w:instrText xml:space="preserve"> PAGEREF _Toc243653426 \h </w:instrText>
             </w:r>
             <w:r>
               <w:rPr>
@@ -1701,7 +1701,7 @@
               <w:lang w:eastAsia="de-DE"/>
             </w:rPr>
           </w:pPr>
-          <w:hyperlink w:anchor="_Toc241412989" w:history="1">
+          <w:hyperlink w:anchor="_Toc243653427" w:history="1">
             <w:r>
               <w:rPr>
                 <w:rStyle w:val="Hyperlink"/>
@@ -1728,7 +1728,7 @@
                 <w:noProof/>
                 <w:webHidden/>
               </w:rPr>
-              <w:instrText xml:space="preserve"> PAGEREF _Toc241412989 \h </w:instrText>
+              <w:instrText xml:space="preserve"> PAGEREF _Toc243653427 \h </w:instrText>
             </w:r>
             <w:r>
               <w:rPr>
@@ -1770,7 +1770,7 @@
               <w:lang w:eastAsia="de-DE"/>
             </w:rPr>
           </w:pPr>
-          <w:hyperlink w:anchor="_Toc241412990" w:history="1">
+          <w:hyperlink w:anchor="_Toc243653428" w:history="1">
             <w:r>
               <w:rPr>
                 <w:rStyle w:val="Hyperlink"/>
@@ -1798,7 +1798,7 @@
                 <w:noProof/>
                 <w:webHidden/>
               </w:rPr>
-              <w:instrText xml:space="preserve"> PAGEREF _Toc241412990 \h </w:instrText>
+              <w:instrText xml:space="preserve"> PAGEREF _Toc243653428 \h </w:instrText>
             </w:r>
             <w:r>
               <w:rPr>
@@ -1840,7 +1840,7 @@
               <w:lang w:eastAsia="de-DE"/>
             </w:rPr>
           </w:pPr>
-          <w:hyperlink w:anchor="_Toc241412991" w:history="1">
+          <w:hyperlink w:anchor="_Toc243653429" w:history="1">
             <w:r>
               <w:rPr>
                 <w:rStyle w:val="Hyperlink"/>
@@ -1868,7 +1868,7 @@
                 <w:noProof/>
                 <w:webHidden/>
               </w:rPr>
-              <w:instrText xml:space="preserve"> PAGEREF _Toc241412991 \h </w:instrText>
+              <w:instrText xml:space="preserve"> PAGEREF _Toc243653429 \h </w:instrText>
             </w:r>
             <w:r>
               <w:rPr>
@@ -1939,7 +1939,7 @@
       <w:pPr>
         <w:pStyle w:val="berschrift1"/>
       </w:pPr>
-      <w:bookmarkStart w:id="0" w:name="_Toc241412971"/>
+      <w:bookmarkStart w:id="0" w:name="_Toc243653409"/>
       <w:r>
         <w:lastRenderedPageBreak/>
         <w:t>Abbildungsverzeichnis</w:t>
@@ -1969,7 +1969,7 @@
       <w:r>
         <w:fldChar w:fldCharType="separate"/>
       </w:r>
-      <w:hyperlink w:anchor="_Toc241412970" w:history="1">
+      <w:hyperlink w:anchor="_Toc243653404" w:history="1">
         <w:r>
           <w:rPr>
             <w:rStyle w:val="Hyperlink"/>
@@ -1996,7 +1996,7 @@
             <w:noProof/>
             <w:webHidden/>
           </w:rPr>
-          <w:instrText xml:space="preserve"> PAGEREF _Toc241412970 \h </w:instrText>
+          <w:instrText xml:space="preserve"> PAGEREF _Toc243653404 \h </w:instrText>
         </w:r>
         <w:r>
           <w:rPr>
@@ -2054,7 +2054,7 @@
           <w:rFonts w:cs="Arial"/>
         </w:rPr>
       </w:pPr>
-      <w:bookmarkStart w:id="1" w:name="_Toc241412972"/>
+      <w:bookmarkStart w:id="1" w:name="_Toc243653410"/>
       <w:r>
         <w:rPr>
           <w:rFonts w:cs="Arial"/>
@@ -2902,7 +2902,7 @@
           <w:rFonts w:cs="Arial"/>
         </w:rPr>
       </w:pPr>
-      <w:bookmarkStart w:id="3" w:name="_Toc241412973"/>
+      <w:bookmarkStart w:id="3" w:name="_Toc243653411"/>
       <w:r>
         <w:rPr>
           <w:rFonts w:cs="Arial"/>
@@ -2982,7 +2982,7 @@
       </w:pPr>
       <w:bookmarkStart w:id="4" w:name="_Toc192768108"/>
       <w:bookmarkStart w:id="5" w:name="_Toc202101948"/>
-      <w:bookmarkStart w:id="6" w:name="_Toc241412974"/>
+      <w:bookmarkStart w:id="6" w:name="_Toc243653412"/>
       <w:r>
         <w:lastRenderedPageBreak/>
         <w:t xml:space="preserve">1. </w:t>
@@ -3037,7 +3037,7 @@
           <w:rFonts w:cs="Arial"/>
         </w:rPr>
       </w:pPr>
-      <w:bookmarkStart w:id="7" w:name="_Toc241412975"/>
+      <w:bookmarkStart w:id="7" w:name="_Toc243653413"/>
       <w:r>
         <w:rPr>
           <w:rFonts w:cs="Arial"/>
@@ -3069,7 +3069,7 @@
       <w:pPr>
         <w:pStyle w:val="berschrift2"/>
       </w:pPr>
-      <w:bookmarkStart w:id="8" w:name="_Toc241412976"/>
+      <w:bookmarkStart w:id="8" w:name="_Toc243653414"/>
       <w:r>
         <w:t>2</w:t>
       </w:r>
@@ -3178,7 +3178,7 @@
       <w:pPr>
         <w:pStyle w:val="berschrift2"/>
       </w:pPr>
-      <w:bookmarkStart w:id="9" w:name="_Toc241412977"/>
+      <w:bookmarkStart w:id="9" w:name="_Toc243653415"/>
       <w:r>
         <w:lastRenderedPageBreak/>
         <w:t>2.</w:t>
@@ -3193,13 +3193,7 @@
     </w:p>
     <w:p>
       <w:r>
-        <w:t xml:space="preserve">Die Spieler stellen </w:t>
-      </w:r>
-      <w:r>
-        <w:t xml:space="preserve">mit </w:t>
-      </w:r>
-      <w:r>
-        <w:t>die wichtigste Stakeholdergruppe dar. Sie verwenden die Anwendung unmittelbar und erwarten einen verständlichen, stabilen und unterhaltsamen Spielablauf.</w:t>
+        <w:t>Die Spieler stellen die wichtigste Stakeholdergruppe dar. Sie verwenden die Anwendung unmittelbar und erwarten einen verständlichen, stabilen und unterhaltsamen Spielablauf.</w:t>
       </w:r>
     </w:p>
     <w:p>
@@ -3318,24 +3312,12 @@
       <w:r>
         <w:t>stabile Anwendung ohne unerwartete Abbrüche</w:t>
       </w:r>
-    </w:p>
-    <w:p>
-      <w:pPr>
-        <w:numPr>
-          <w:ilvl w:val="0"/>
-          <w:numId w:val="41"/>
-        </w:numPr>
-        <w:spacing w:line="240" w:lineRule="auto"/>
-      </w:pPr>
-      <w:r>
-        <w:t>denselben synchronisierten Spielzustand wie die übrigen Spieler erhalten</w:t>
-      </w:r>
+      <w:bookmarkStart w:id="10" w:name="_Toc243653416"/>
     </w:p>
     <w:p>
       <w:pPr>
         <w:pStyle w:val="berschrift2"/>
       </w:pPr>
-      <w:bookmarkStart w:id="10" w:name="_Toc241412978"/>
       <w:r>
         <w:t>2.</w:t>
       </w:r>
@@ -3432,7 +3414,7 @@
           <w:rFonts w:cs="Arial"/>
         </w:rPr>
       </w:pPr>
-      <w:bookmarkStart w:id="11" w:name="_Toc241412979"/>
+      <w:bookmarkStart w:id="11" w:name="_Toc243653417"/>
       <w:r>
         <w:rPr>
           <w:rFonts w:cs="Arial"/>
@@ -3474,7 +3456,7 @@
       <w:pPr>
         <w:pStyle w:val="berschrift2"/>
       </w:pPr>
-      <w:bookmarkStart w:id="12" w:name="_Toc241412980"/>
+      <w:bookmarkStart w:id="12" w:name="_Toc243653418"/>
       <w:r>
         <w:t xml:space="preserve">3.1 </w:t>
       </w:r>
@@ -3543,14 +3525,14 @@
         </w:rPr>
         <w:t>: FA-01-0</w:t>
       </w:r>
+      <w:bookmarkEnd w:id="13"/>
       <w:r>
         <w:rPr>
           <w:sz w:val="22"/>
           <w:szCs w:val="22"/>
         </w:rPr>
-        <w:t>4</w:t>
-      </w:r>
-      <w:bookmarkEnd w:id="13"/>
+        <w:t>5</w:t>
+      </w:r>
     </w:p>
     <w:tbl>
       <w:tblPr>
@@ -3656,10 +3638,13 @@
               <w:t xml:space="preserve">Als Spieler möchte ich einer bestehenden Partie </w:t>
             </w:r>
             <w:r>
-              <w:t>über die Webanwendung</w:t>
-            </w:r>
-            <w:r>
-              <w:t xml:space="preserve"> beitreten können, damit ich mit einer anderen Person auf einem separaten Endgerät spielen kann.</w:t>
+              <w:t>über deren Partie-ID</w:t>
+            </w:r>
+            <w:r>
+              <w:t xml:space="preserve"> </w:t>
+            </w:r>
+            <w:r>
+              <w:t>beitreten können, damit ich mit einer anderen Person auf einem separaten Endgerät spielen kann.</w:t>
             </w:r>
           </w:p>
         </w:tc>
@@ -3692,25 +3677,17 @@
               <w:spacing w:after="120"/>
             </w:pPr>
             <w:r>
-              <w:t xml:space="preserve">Als </w:t>
-            </w:r>
-            <w:r>
-              <w:t>Spieler</w:t>
-            </w:r>
-            <w:r>
-              <w:t xml:space="preserve"> möchte ich </w:t>
-            </w:r>
-            <w:r>
-              <w:t>die</w:t>
-            </w:r>
-            <w:r>
-              <w:t xml:space="preserve"> Partie </w:t>
-            </w:r>
-            <w:r>
-              <w:t>starten</w:t>
-            </w:r>
-            <w:r>
-              <w:t xml:space="preserve"> können, sobald die erforderliche Anzahl an Spieler verbunden ist.</w:t>
+              <w:t xml:space="preserve">Als Host-Spieler möchte ich die Partie starten können, sobald mindestens zwei </w:t>
+            </w:r>
+            <w:proofErr w:type="spellStart"/>
+            <w:proofErr w:type="gramStart"/>
+            <w:r>
+              <w:t>Spieler:innen</w:t>
+            </w:r>
+            <w:proofErr w:type="spellEnd"/>
+            <w:proofErr w:type="gramEnd"/>
+            <w:r>
+              <w:t xml:space="preserve"> verbunden sind.</w:t>
             </w:r>
           </w:p>
         </w:tc>
@@ -3744,6 +3721,28 @@
             </w:pPr>
             <w:r>
               <w:t>Als Spieler möchte ich vor Spielbeginn einen verfügbaren Charakter auswählen können, damit ich dessen individuelle Fähigkeit während der Partie verwenden kann.</w:t>
+            </w:r>
+          </w:p>
+        </w:tc>
+      </w:tr>
+      <w:tr>
+        <w:tc>
+          <w:tcPr>
+            <w:tcW w:w="474" w:type="pct"/>
+          </w:tcPr>
+          <w:p>
+            <w:r>
+              <w:t>FA-05</w:t>
+            </w:r>
+          </w:p>
+        </w:tc>
+        <w:tc>
+          <w:tcPr>
+            <w:tcW w:w="4526" w:type="pct"/>
+          </w:tcPr>
+          <w:p>
+            <w:r>
+              <w:t>Als Spieler möchte ich vor dem Erstellen oder Beitreten einer Partie einen Spielernamen festlegen können, damit ich innerhalb der Partie eindeutig dargestellt werden kann.</w:t>
             </w:r>
           </w:p>
         </w:tc>
@@ -3840,7 +3839,13 @@
         <w:spacing w:line="240" w:lineRule="auto"/>
       </w:pPr>
       <w:r>
-        <w:t>Derselbe Charakter darf innerhalb einer Partie nicht mehrfach vergeben werden</w:t>
+        <w:t xml:space="preserve">Derselbe Charakter darf innerhalb einer Partie nicht mehrfach </w:t>
+      </w:r>
+      <w:r>
+        <w:t>ausgewählt</w:t>
+      </w:r>
+      <w:r>
+        <w:t xml:space="preserve"> werden</w:t>
       </w:r>
     </w:p>
     <w:p>
@@ -3856,6 +3861,18 @@
       </w:r>
     </w:p>
     <w:p>
+      <w:pPr>
+        <w:numPr>
+          <w:ilvl w:val="0"/>
+          <w:numId w:val="28"/>
+        </w:numPr>
+        <w:spacing w:line="240" w:lineRule="auto"/>
+      </w:pPr>
+      <w:r>
+        <w:t>Jeder Spieler erhält einen Spielernamen zur eindeutigen Identifikation innerhalb des Spiels</w:t>
+      </w:r>
+    </w:p>
+    <w:p>
       <w:r>
         <w:br w:type="page"/>
       </w:r>
@@ -3864,7 +3881,7 @@
       <w:pPr>
         <w:pStyle w:val="berschrift2"/>
       </w:pPr>
-      <w:bookmarkStart w:id="14" w:name="_Toc241412981"/>
+      <w:bookmarkStart w:id="14" w:name="_Toc243653419"/>
       <w:r>
         <w:lastRenderedPageBreak/>
         <w:t>3.2 Spielfeld</w:t>
@@ -3943,9 +3960,30 @@
           <w:sz w:val="22"/>
           <w:szCs w:val="22"/>
         </w:rPr>
-        <w:t>05-09</w:t>
+        <w:t>0</w:t>
+      </w:r>
+      <w:r>
+        <w:rPr>
+          <w:sz w:val="22"/>
+          <w:szCs w:val="22"/>
+        </w:rPr>
+        <w:t>6</w:t>
+      </w:r>
+      <w:r>
+        <w:rPr>
+          <w:sz w:val="22"/>
+          <w:szCs w:val="22"/>
+        </w:rPr>
+        <w:t>-</w:t>
       </w:r>
       <w:bookmarkEnd w:id="15"/>
+      <w:r>
+        <w:rPr>
+          <w:sz w:val="22"/>
+          <w:szCs w:val="22"/>
+        </w:rPr>
+        <w:t>10</w:t>
+      </w:r>
     </w:p>
     <w:tbl>
       <w:tblPr>
@@ -4001,7 +4039,7 @@
               <w:t>FA-0</w:t>
             </w:r>
             <w:r>
-              <w:t>5</w:t>
+              <w:t>6</w:t>
             </w:r>
           </w:p>
         </w:tc>
@@ -4034,7 +4072,7 @@
               <w:t>FA-0</w:t>
             </w:r>
             <w:r>
-              <w:t>6</w:t>
+              <w:t>7</w:t>
             </w:r>
           </w:p>
         </w:tc>
@@ -4067,7 +4105,7 @@
               <w:t>FA-0</w:t>
             </w:r>
             <w:r>
-              <w:t>7</w:t>
+              <w:t>8</w:t>
             </w:r>
           </w:p>
         </w:tc>
@@ -4100,7 +4138,7 @@
               <w:t>FA-0</w:t>
             </w:r>
             <w:r>
-              <w:t>8</w:t>
+              <w:t>9</w:t>
             </w:r>
           </w:p>
         </w:tc>
@@ -4133,7 +4171,7 @@
               <w:t>FA-</w:t>
             </w:r>
             <w:r>
-              <w:t>09</w:t>
+              <w:t>10</w:t>
             </w:r>
           </w:p>
         </w:tc>
@@ -4197,6 +4235,12 @@
       <w:r>
         <w:t xml:space="preserve"> und kann </w:t>
       </w:r>
+      <w:r>
+        <w:t>in 90° Schritten</w:t>
+      </w:r>
+      <w:r>
+        <w:t xml:space="preserve"> gedreht werden. </w:t>
+      </w:r>
     </w:p>
     <w:p>
       <w:pPr>
@@ -4207,7 +4251,7 @@
         <w:spacing w:line="240" w:lineRule="auto"/>
       </w:pPr>
       <w:r>
-        <w:t xml:space="preserve">Die freie Kachel kann schrittweise gedreht werden. </w:t>
+        <w:t xml:space="preserve">Nur zulässige Einschubpositionen können ausgewählt werden. </w:t>
       </w:r>
     </w:p>
     <w:p>
@@ -4219,7 +4263,7 @@
         <w:spacing w:line="240" w:lineRule="auto"/>
       </w:pPr>
       <w:r>
-        <w:t xml:space="preserve">Nur zulässige Einschubpositionen können ausgewählt werden. </w:t>
+        <w:t xml:space="preserve">Beim Einschieben wird eine vollständige Reihe beziehungsweise Spalte verschoben. </w:t>
       </w:r>
     </w:p>
     <w:p>
@@ -4231,7 +4275,7 @@
         <w:spacing w:line="240" w:lineRule="auto"/>
       </w:pPr>
       <w:r>
-        <w:t xml:space="preserve">Beim Einschieben wird eine vollständige Reihe beziehungsweise Spalte verschoben. </w:t>
+        <w:t xml:space="preserve">Die am gegenüberliegenden Rand herausgeschobene Kachel wird zur neuen freien Kachel. </w:t>
       </w:r>
     </w:p>
     <w:p>
@@ -4243,18 +4287,6 @@
         <w:spacing w:line="240" w:lineRule="auto"/>
       </w:pPr>
       <w:r>
-        <w:t xml:space="preserve">Die am gegenüberliegenden Rand herausgeschobene Kachel wird zur neuen freien Kachel. </w:t>
-      </w:r>
-    </w:p>
-    <w:p>
-      <w:pPr>
-        <w:numPr>
-          <w:ilvl w:val="0"/>
-          <w:numId w:val="30"/>
-        </w:numPr>
-        <w:spacing w:line="240" w:lineRule="auto"/>
-      </w:pPr>
-      <w:r>
         <w:t>Der neue Zustand wird auf allen verbundenen Endgeräten synchron dargestellt.</w:t>
       </w:r>
     </w:p>
@@ -4262,7 +4294,7 @@
       <w:pPr>
         <w:pStyle w:val="berschrift2"/>
       </w:pPr>
-      <w:bookmarkStart w:id="16" w:name="_Toc241412982"/>
+      <w:bookmarkStart w:id="16" w:name="_Toc243653420"/>
       <w:r>
         <w:t>3.3 Bewegung der Spielfiguren</w:t>
       </w:r>
@@ -4340,23 +4372,37 @@
           <w:sz w:val="22"/>
           <w:szCs w:val="22"/>
         </w:rPr>
-        <w:t>-10</w:t>
+        <w:t>-1</w:t>
       </w:r>
       <w:r>
         <w:rPr>
           <w:sz w:val="22"/>
           <w:szCs w:val="22"/>
         </w:rPr>
-        <w:t>-</w:t>
+        <w:t>1</w:t>
       </w:r>
       <w:r>
         <w:rPr>
           <w:sz w:val="22"/>
           <w:szCs w:val="22"/>
         </w:rPr>
-        <w:t>12</w:t>
+        <w:t>-</w:t>
+      </w:r>
+      <w:r>
+        <w:rPr>
+          <w:sz w:val="22"/>
+          <w:szCs w:val="22"/>
+        </w:rPr>
+        <w:t>1</w:t>
       </w:r>
       <w:bookmarkEnd w:id="17"/>
+      <w:r>
+        <w:rPr>
+          <w:sz w:val="22"/>
+          <w:szCs w:val="22"/>
+        </w:rPr>
+        <w:t>3</w:t>
+      </w:r>
     </w:p>
     <w:tbl>
       <w:tblPr>
@@ -4412,7 +4458,7 @@
               <w:t>FA-1</w:t>
             </w:r>
             <w:r>
-              <w:t>0</w:t>
+              <w:t>1</w:t>
             </w:r>
           </w:p>
         </w:tc>
@@ -4451,7 +4497,7 @@
               <w:t>FA-1</w:t>
             </w:r>
             <w:r>
-              <w:t>1</w:t>
+              <w:t>2</w:t>
             </w:r>
           </w:p>
         </w:tc>
@@ -4484,7 +4530,7 @@
               <w:t>FA-1</w:t>
             </w:r>
             <w:r>
-              <w:t>2</w:t>
+              <w:t>3</w:t>
             </w:r>
           </w:p>
         </w:tc>
@@ -4540,7 +4586,13 @@
       </w:r>
       <w:proofErr w:type="spellEnd"/>
       <w:r>
-        <w:t xml:space="preserve"> werden die vom aktuellen Standort erreichbaren Felder berechnet. </w:t>
+        <w:t xml:space="preserve"> werden die vom aktuellen Standort erreichbaren Felder berechnet</w:t>
+      </w:r>
+      <w:r>
+        <w:t xml:space="preserve"> und für alle Spieler erkennbar dargestellt</w:t>
+      </w:r>
+      <w:r>
+        <w:t xml:space="preserve">. </w:t>
       </w:r>
     </w:p>
     <w:p>
@@ -4583,7 +4635,7 @@
       <w:pPr>
         <w:pStyle w:val="berschrift2"/>
       </w:pPr>
-      <w:bookmarkStart w:id="18" w:name="_Toc241412983"/>
+      <w:bookmarkStart w:id="18" w:name="_Toc243653421"/>
       <w:r>
         <w:t>3.4 Zielkarten und Artefakte</w:t>
       </w:r>
@@ -4647,16 +4699,30 @@
           <w:sz w:val="22"/>
           <w:szCs w:val="22"/>
         </w:rPr>
-        <w:t>: FA-13-1</w:t>
+        <w:t>: FA-1</w:t>
       </w:r>
       <w:r>
         <w:rPr>
           <w:sz w:val="22"/>
           <w:szCs w:val="22"/>
         </w:rPr>
-        <w:t>5</w:t>
+        <w:t>4</w:t>
+      </w:r>
+      <w:r>
+        <w:rPr>
+          <w:sz w:val="22"/>
+          <w:szCs w:val="22"/>
+        </w:rPr>
+        <w:t>-1</w:t>
       </w:r>
       <w:bookmarkEnd w:id="19"/>
+      <w:r>
+        <w:rPr>
+          <w:sz w:val="22"/>
+          <w:szCs w:val="22"/>
+        </w:rPr>
+        <w:t>6</w:t>
+      </w:r>
     </w:p>
     <w:tbl>
       <w:tblPr>
@@ -4718,7 +4784,7 @@
               <w:t>FA-1</w:t>
             </w:r>
             <w:r>
-              <w:t>3</w:t>
+              <w:t>4</w:t>
             </w:r>
           </w:p>
         </w:tc>
@@ -4754,7 +4820,7 @@
               <w:t>FA-1</w:t>
             </w:r>
             <w:r>
-              <w:t>4</w:t>
+              <w:t>5</w:t>
             </w:r>
           </w:p>
         </w:tc>
@@ -4790,7 +4856,7 @@
               <w:t>FA-1</w:t>
             </w:r>
             <w:r>
-              <w:t>5</w:t>
+              <w:t>6</w:t>
             </w:r>
           </w:p>
         </w:tc>
@@ -4877,7 +4943,7 @@
       <w:pPr>
         <w:pStyle w:val="berschrift2"/>
       </w:pPr>
-      <w:bookmarkStart w:id="20" w:name="_Toc241412984"/>
+      <w:bookmarkStart w:id="20" w:name="_Toc243653422"/>
       <w:r>
         <w:t>3.5 Spezialkachel Portal</w:t>
       </w:r>
@@ -4951,7 +5017,7 @@
           <w:sz w:val="22"/>
           <w:szCs w:val="22"/>
         </w:rPr>
-        <w:t>6</w:t>
+        <w:t>7</w:t>
       </w:r>
       <w:r>
         <w:rPr>
@@ -4960,14 +5026,14 @@
         </w:rPr>
         <w:t>-</w:t>
       </w:r>
+      <w:bookmarkEnd w:id="21"/>
       <w:r>
         <w:rPr>
           <w:sz w:val="22"/>
           <w:szCs w:val="22"/>
         </w:rPr>
-        <w:t>19</w:t>
-      </w:r>
-      <w:bookmarkEnd w:id="21"/>
+        <w:t>20</w:t>
+      </w:r>
     </w:p>
     <w:tbl>
       <w:tblPr>
@@ -5023,7 +5089,7 @@
               <w:t>FA-1</w:t>
             </w:r>
             <w:r>
-              <w:t>6</w:t>
+              <w:t>7</w:t>
             </w:r>
           </w:p>
         </w:tc>
@@ -5037,7 +5103,16 @@
               <w:spacing w:after="120"/>
             </w:pPr>
             <w:r>
-              <w:t>Als Spieler möchte ich ein Portal nutzen können, wenn meine Figur eine Portal-Kachel erreichen kann, damit ich zusätzliche Bewegungsmöglichkeiten erhalte.</w:t>
+              <w:t>Als Spieler möchte ich</w:t>
+            </w:r>
+            <w:r>
+              <w:t xml:space="preserve">, dass meine Figur </w:t>
+            </w:r>
+            <w:r>
+              <w:t xml:space="preserve">beim Betreten einer Portalkachel auf der zweiten Portalkachel erscheint, </w:t>
+            </w:r>
+            <w:r>
+              <w:t>damit ich zusätzliche Bewegungsmöglichkeiten erhalte.</w:t>
             </w:r>
           </w:p>
         </w:tc>
@@ -5056,7 +5131,7 @@
               <w:t>FA-1</w:t>
             </w:r>
             <w:r>
-              <w:t>7</w:t>
+              <w:t>8</w:t>
             </w:r>
           </w:p>
         </w:tc>
@@ -5070,15 +5145,7 @@
               <w:spacing w:after="120"/>
             </w:pPr>
             <w:r>
-              <w:t xml:space="preserve">Als Spieler möchte ich erkennen können, welche </w:t>
-            </w:r>
-            <w:proofErr w:type="gramStart"/>
-            <w:r>
-              <w:t>beiden Portale</w:t>
-            </w:r>
-            <w:proofErr w:type="gramEnd"/>
-            <w:r>
-              <w:t xml:space="preserve"> miteinander verbunden sind.</w:t>
+              <w:t>Als Spieler möchte ich erkennen können, welche beiden Portale miteinander verbunden sind.</w:t>
             </w:r>
           </w:p>
         </w:tc>
@@ -5093,7 +5160,10 @@
               <w:t>FA-</w:t>
             </w:r>
             <w:r>
-              <w:t>18</w:t>
+              <w:t>1</w:t>
+            </w:r>
+            <w:r>
+              <w:t>9</w:t>
             </w:r>
           </w:p>
         </w:tc>
@@ -5124,7 +5194,7 @@
               <w:t>FA-</w:t>
             </w:r>
             <w:r>
-              <w:t>19</w:t>
+              <w:t>20</w:t>
             </w:r>
           </w:p>
         </w:tc>
@@ -5237,7 +5307,13 @@
         <w:spacing w:line="240" w:lineRule="auto"/>
       </w:pPr>
       <w:r>
-        <w:t xml:space="preserve">Besitzt der Spieler das erforderliche Schlüssel-Artefakt, darf er das Tor passieren. </w:t>
+        <w:t>Wurde das</w:t>
+      </w:r>
+      <w:r>
+        <w:t xml:space="preserve"> Schlüsselobjekt aktiviert, darf ein Spieler das Tor passieren.</w:t>
+      </w:r>
+      <w:r>
+        <w:t xml:space="preserve"> </w:t>
       </w:r>
     </w:p>
     <w:p>
@@ -5256,7 +5332,7 @@
       <w:pPr>
         <w:pStyle w:val="berschrift2"/>
       </w:pPr>
-      <w:bookmarkStart w:id="22" w:name="_Toc241412985"/>
+      <w:bookmarkStart w:id="22" w:name="_Toc243653423"/>
       <w:r>
         <w:t>3.</w:t>
       </w:r>
@@ -5333,7 +5409,7 @@
           <w:sz w:val="22"/>
           <w:szCs w:val="22"/>
         </w:rPr>
-        <w:t>0</w:t>
+        <w:t>1</w:t>
       </w:r>
       <w:r>
         <w:rPr>
@@ -5342,14 +5418,14 @@
         </w:rPr>
         <w:t>-2</w:t>
       </w:r>
+      <w:bookmarkEnd w:id="23"/>
       <w:r>
         <w:rPr>
           <w:sz w:val="22"/>
           <w:szCs w:val="22"/>
         </w:rPr>
-        <w:t>1</w:t>
-      </w:r>
-      <w:bookmarkEnd w:id="23"/>
+        <w:t>2</w:t>
+      </w:r>
     </w:p>
     <w:tbl>
       <w:tblPr>
@@ -5405,7 +5481,7 @@
               <w:t>FA-2</w:t>
             </w:r>
             <w:r>
-              <w:t>0</w:t>
+              <w:t>1</w:t>
             </w:r>
           </w:p>
         </w:tc>
@@ -5450,7 +5526,7 @@
               <w:t>FA-2</w:t>
             </w:r>
             <w:r>
-              <w:t>1</w:t>
+              <w:t>2</w:t>
             </w:r>
           </w:p>
         </w:tc>
@@ -5565,7 +5641,24 @@
         <w:t xml:space="preserve">. </w:t>
       </w:r>
       <w:r>
-        <w:t>Andere Charaktere benötigen weiterhin das entsprechende Schlüssel-Artefakt.</w:t>
+        <w:t xml:space="preserve">Andere Charaktere benötigen weiterhin das </w:t>
+      </w:r>
+      <w:r>
+        <w:t>aktivierte</w:t>
+      </w:r>
+      <w:r>
+        <w:t xml:space="preserve"> </w:t>
+      </w:r>
+      <w:proofErr w:type="gramStart"/>
+      <w:r>
+        <w:t>Schlüssel-Artefakt</w:t>
+      </w:r>
+      <w:proofErr w:type="gramEnd"/>
+      <w:r>
+        <w:t xml:space="preserve"> um zu passieren</w:t>
+      </w:r>
+      <w:r>
+        <w:t>.</w:t>
       </w:r>
     </w:p>
     <w:p>
@@ -5577,7 +5670,7 @@
       <w:pPr>
         <w:pStyle w:val="berschrift2"/>
       </w:pPr>
-      <w:bookmarkStart w:id="24" w:name="_Toc241412986"/>
+      <w:bookmarkStart w:id="24" w:name="_Toc243653424"/>
       <w:r>
         <w:lastRenderedPageBreak/>
         <w:t>3.</w:t>
@@ -5655,7 +5748,7 @@
           <w:sz w:val="22"/>
           <w:szCs w:val="22"/>
         </w:rPr>
-        <w:t>2</w:t>
+        <w:t>3</w:t>
       </w:r>
       <w:r>
         <w:rPr>
@@ -5664,14 +5757,14 @@
         </w:rPr>
         <w:t>-2</w:t>
       </w:r>
+      <w:bookmarkEnd w:id="25"/>
       <w:r>
         <w:rPr>
           <w:sz w:val="22"/>
           <w:szCs w:val="22"/>
         </w:rPr>
-        <w:t>4</w:t>
-      </w:r>
-      <w:bookmarkEnd w:id="25"/>
+        <w:t>5</w:t>
+      </w:r>
     </w:p>
     <w:tbl>
       <w:tblPr>
@@ -5730,7 +5823,7 @@
               <w:t>2</w:t>
             </w:r>
             <w:r>
-              <w:t>2</w:t>
+              <w:t>3</w:t>
             </w:r>
           </w:p>
         </w:tc>
@@ -5763,7 +5856,7 @@
               <w:t>FA-2</w:t>
             </w:r>
             <w:r>
-              <w:t>3</w:t>
+              <w:t>4</w:t>
             </w:r>
           </w:p>
         </w:tc>
@@ -5796,7 +5889,7 @@
               <w:t>FA-2</w:t>
             </w:r>
             <w:r>
-              <w:t>4</w:t>
+              <w:t>5</w:t>
             </w:r>
           </w:p>
         </w:tc>
@@ -5810,7 +5903,13 @@
               <w:spacing w:after="120"/>
             </w:pPr>
             <w:r>
-              <w:t>Als Spieler möchte ich keine Aktionen durchführen können, wenn ein anderer Spieler am Zug ist.</w:t>
+              <w:t xml:space="preserve">Als Spieler möchte ich keine </w:t>
+            </w:r>
+            <w:r>
+              <w:t xml:space="preserve">spielverändernden </w:t>
+            </w:r>
+            <w:r>
+              <w:t>Aktionen durchführen können, wenn ein anderer Spieler am Zug ist.</w:t>
             </w:r>
           </w:p>
         </w:tc>
@@ -5886,7 +5985,7 @@
       <w:pPr>
         <w:pStyle w:val="berschrift2"/>
       </w:pPr>
-      <w:bookmarkStart w:id="26" w:name="_Toc241412987"/>
+      <w:bookmarkStart w:id="26" w:name="_Toc243653425"/>
       <w:r>
         <w:t>3.</w:t>
       </w:r>
@@ -5966,7 +6065,7 @@
           <w:sz w:val="22"/>
           <w:szCs w:val="22"/>
         </w:rPr>
-        <w:t>5</w:t>
+        <w:t>6</w:t>
       </w:r>
       <w:r>
         <w:rPr>
@@ -5975,14 +6074,14 @@
         </w:rPr>
         <w:t>-2</w:t>
       </w:r>
+      <w:bookmarkEnd w:id="27"/>
       <w:r>
         <w:rPr>
           <w:sz w:val="22"/>
           <w:szCs w:val="22"/>
         </w:rPr>
-        <w:t>7</w:t>
-      </w:r>
-      <w:bookmarkEnd w:id="27"/>
+        <w:t>8</w:t>
+      </w:r>
     </w:p>
     <w:tbl>
       <w:tblPr>
@@ -6038,7 +6137,7 @@
               <w:t>FA-2</w:t>
             </w:r>
             <w:r>
-              <w:t>5</w:t>
+              <w:t>6</w:t>
             </w:r>
           </w:p>
         </w:tc>
@@ -6052,7 +6151,13 @@
               <w:spacing w:after="120"/>
             </w:pPr>
             <w:r>
-              <w:t>Als Spieler möchte ich in meinem Webbrowser denselben Spielzustand sehen wie mein Mitspieler, damit eine gemeinsame Partie möglich ist.</w:t>
+              <w:t>Als Spieler möchte ich in meinem Webbrowser denselben Spielzustand sehen wie mein</w:t>
+            </w:r>
+            <w:r>
+              <w:t>e</w:t>
+            </w:r>
+            <w:r>
+              <w:t xml:space="preserve"> Mitspieler, damit eine gemeinsame Partie möglich ist.</w:t>
             </w:r>
           </w:p>
         </w:tc>
@@ -6071,7 +6176,7 @@
               <w:t>FA-2</w:t>
             </w:r>
             <w:r>
-              <w:t>6</w:t>
+              <w:t>7</w:t>
             </w:r>
           </w:p>
         </w:tc>
@@ -6085,7 +6190,7 @@
               <w:spacing w:after="120"/>
             </w:pPr>
             <w:r>
-              <w:t>Als Spieler möchte ich, dass meine gültigen Spielaktionen über den Webserver automatisch an die anderen verbundenen Browser-Sitzungen übertragen werden.</w:t>
+              <w:t>Als Spieler möchte ich, dass meine gültigen Spielaktionen automatisch bei allen verbundenen Spielern aktualisiert werden, damit alle den aktuellen gemeinsamen Spielzustand sehen</w:t>
             </w:r>
           </w:p>
         </w:tc>
@@ -6104,7 +6209,7 @@
               <w:t>FA-2</w:t>
             </w:r>
             <w:r>
-              <w:t>7</w:t>
+              <w:t>8</w:t>
             </w:r>
           </w:p>
         </w:tc>
@@ -6152,7 +6257,13 @@
         <w:spacing w:line="240" w:lineRule="auto"/>
       </w:pPr>
       <w:r>
-        <w:t>Nach einer gültigen Aktion müssen auf allen verbundenen Endgeräten insbesondere dieselben Informationen vorliegen</w:t>
+        <w:t xml:space="preserve">Nach einer gültigen Aktion müssen </w:t>
+      </w:r>
+      <w:r>
+        <w:t>bei allen verbundenen Spielern</w:t>
+      </w:r>
+      <w:r>
+        <w:t xml:space="preserve"> dieselben Informationen vorliegen</w:t>
       </w:r>
       <w:r>
         <w:t>.</w:t>
@@ -6183,7 +6294,7 @@
           <w:rFonts w:ascii="Times New Roman" w:hAnsi="Times New Roman"/>
         </w:rPr>
       </w:pPr>
-      <w:bookmarkStart w:id="28" w:name="_Toc241412988"/>
+      <w:bookmarkStart w:id="28" w:name="_Toc243653426"/>
       <w:r>
         <w:lastRenderedPageBreak/>
         <w:t>3.9 Siegbedingung und Spielende</w:t>
@@ -6255,7 +6366,7 @@
           <w:sz w:val="22"/>
           <w:szCs w:val="22"/>
         </w:rPr>
-        <w:t>8</w:t>
+        <w:t>9</w:t>
       </w:r>
       <w:r>
         <w:rPr>
@@ -6264,14 +6375,14 @@
         </w:rPr>
         <w:t>-</w:t>
       </w:r>
+      <w:bookmarkEnd w:id="29"/>
       <w:r>
         <w:rPr>
           <w:sz w:val="22"/>
           <w:szCs w:val="22"/>
         </w:rPr>
-        <w:t>29</w:t>
-      </w:r>
-      <w:bookmarkEnd w:id="29"/>
+        <w:t>30</w:t>
+      </w:r>
     </w:p>
     <w:tbl>
       <w:tblPr>
@@ -6345,7 +6456,7 @@
                 <w:b w:val="0"/>
                 <w:bCs w:val="0"/>
               </w:rPr>
-              <w:t>8</w:t>
+              <w:t>9</w:t>
             </w:r>
           </w:p>
         </w:tc>
@@ -6388,7 +6499,7 @@
                 <w:b w:val="0"/>
                 <w:bCs w:val="0"/>
               </w:rPr>
-              <w:t>2</w:t>
+              <w:t>3</w:t>
             </w:r>
             <w:r>
               <w:rPr>
@@ -6396,7 +6507,7 @@
                 <w:b w:val="0"/>
                 <w:bCs w:val="0"/>
               </w:rPr>
-              <w:t>9</w:t>
+              <w:t>0</w:t>
             </w:r>
           </w:p>
         </w:tc>
@@ -6495,7 +6606,7 @@
       <w:pPr>
         <w:pStyle w:val="berschrift2"/>
       </w:pPr>
-      <w:bookmarkStart w:id="30" w:name="_Toc241412989"/>
+      <w:bookmarkStart w:id="30" w:name="_Toc243653427"/>
       <w:r>
         <w:t>3.10 UML-Use-Case-Diagramm</w:t>
       </w:r>
@@ -6622,7 +6733,7 @@
         <w:keepNext/>
       </w:pPr>
       <w:bookmarkStart w:id="31" w:name="_Toc241407898"/>
-      <w:bookmarkStart w:id="32" w:name="_Toc241412970"/>
+      <w:bookmarkStart w:id="32" w:name="_Toc243653404"/>
       <w:r>
         <w:rPr>
           <w:sz w:val="22"/>
@@ -6742,7 +6853,7 @@
           <w:rFonts w:cs="Arial"/>
         </w:rPr>
       </w:pPr>
-      <w:bookmarkStart w:id="33" w:name="_Toc241412990"/>
+      <w:bookmarkStart w:id="33" w:name="_Toc243653428"/>
       <w:r>
         <w:rPr>
           <w:rFonts w:cs="Arial"/>
@@ -6775,13 +6886,16 @@
         <w:t xml:space="preserve"> beschreiben die Qualitätsmerkmale der Anwendung. Für Mystic Maze sind insbesondere Benutzerfreundlichkeit, Performance, Zuverlässigkeit, Konsistenz</w:t>
       </w:r>
       <w:r>
-        <w:t xml:space="preserve"> und</w:t>
-      </w:r>
-      <w:r>
-        <w:t xml:space="preserve"> Wartbarkei</w:t>
+        <w:t xml:space="preserve">, </w:t>
+      </w:r>
+      <w:r>
+        <w:t>Wartbarkei</w:t>
       </w:r>
       <w:r>
         <w:t>t</w:t>
+      </w:r>
+      <w:r>
+        <w:t xml:space="preserve"> und Skalierbarkeit</w:t>
       </w:r>
       <w:r>
         <w:t xml:space="preserve"> relevant.</w:t>
@@ -6852,9 +6966,16 @@
           <w:sz w:val="22"/>
           <w:szCs w:val="22"/>
         </w:rPr>
-        <w:t>-01-13</w:t>
+        <w:t>-01-1</w:t>
       </w:r>
       <w:bookmarkEnd w:id="34"/>
+      <w:r>
+        <w:rPr>
+          <w:sz w:val="22"/>
+          <w:szCs w:val="22"/>
+        </w:rPr>
+        <w:t>4</w:t>
+      </w:r>
     </w:p>
     <w:tbl>
       <w:tblPr>
@@ -7381,6 +7502,39 @@
           </w:p>
         </w:tc>
       </w:tr>
+      <w:tr>
+        <w:tc>
+          <w:tcPr>
+            <w:tcW w:w="988" w:type="dxa"/>
+          </w:tcPr>
+          <w:p>
+            <w:r>
+              <w:lastRenderedPageBreak/>
+              <w:t>NFA-14</w:t>
+            </w:r>
+          </w:p>
+        </w:tc>
+        <w:tc>
+          <w:tcPr>
+            <w:tcW w:w="1559" w:type="dxa"/>
+          </w:tcPr>
+          <w:p>
+            <w:r>
+              <w:t>Skalierbarkeit</w:t>
+            </w:r>
+          </w:p>
+        </w:tc>
+        <w:tc>
+          <w:tcPr>
+            <w:tcW w:w="7081" w:type="dxa"/>
+          </w:tcPr>
+          <w:p>
+            <w:r>
+              <w:t>Die Webanwendung soll so ausgelegt sein, dass die unterstützte Spielerzahl pro Partie von zwei auf bis zu vier Spieler erweitert werden kann, ohne die zentrale Spiellogik grundlegend anzupassen.</w:t>
+            </w:r>
+          </w:p>
+        </w:tc>
+      </w:tr>
     </w:tbl>
     <w:p>
       <w:pPr>
@@ -7399,12 +7553,11 @@
           <w:rFonts w:cs="Arial"/>
         </w:rPr>
       </w:pPr>
-      <w:bookmarkStart w:id="35" w:name="_Toc241412991"/>
+      <w:bookmarkStart w:id="35" w:name="_Toc243653429"/>
       <w:r>
         <w:rPr>
           <w:rFonts w:cs="Arial"/>
         </w:rPr>
-        <w:lastRenderedPageBreak/>
         <w:t>5</w:t>
       </w:r>
       <w:r>
@@ -7980,6 +8133,7 @@
           </w:tcPr>
           <w:p>
             <w:r>
+              <w:lastRenderedPageBreak/>
               <w:t>T-Kreuzung</w:t>
             </w:r>
           </w:p>
@@ -8052,7 +8206,6 @@
           </w:tcPr>
           <w:p>
             <w:r>
-              <w:lastRenderedPageBreak/>
               <w:t>Wegfindung</w:t>
             </w:r>
           </w:p>
@@ -8132,7 +8285,7 @@
           </w:tcPr>
           <w:p>
             <w:r>
-              <w:t>Vorgabe für ein vom Spieler zu erreichendes Artefakt oder einen besonderen Ort.</w:t>
+              <w:t>Vorgabe für ein vom Spieler zu erreichendes Artefakt.</w:t>
             </w:r>
           </w:p>
         </w:tc>

</xml_diff>

<commit_message>
docs: update docu for phase 2
</commit_message>
<xml_diff>
--- a/docs/phase 2/Anforderungsdokument.docx
+++ b/docs/phase 2/Anforderungsdokument.docx
@@ -298,7 +298,7 @@
         <w:rPr>
           <w:rFonts w:cs="Arial"/>
         </w:rPr>
-        <w:t>xx</w:t>
+        <w:t>30</w:t>
       </w:r>
       <w:r>
         <w:rPr>
@@ -416,7 +416,7 @@
             </w:rPr>
             <w:fldChar w:fldCharType="separate"/>
           </w:r>
-          <w:hyperlink w:anchor="_Toc243653409" w:history="1">
+          <w:hyperlink w:anchor="_Toc244261982" w:history="1">
             <w:r>
               <w:rPr>
                 <w:rStyle w:val="Hyperlink"/>
@@ -443,7 +443,7 @@
                 <w:noProof/>
                 <w:webHidden/>
               </w:rPr>
-              <w:instrText xml:space="preserve"> PAGEREF _Toc243653409 \h </w:instrText>
+              <w:instrText xml:space="preserve"> PAGEREF _Toc244261982 \h </w:instrText>
             </w:r>
             <w:r>
               <w:rPr>
@@ -485,7 +485,7 @@
               <w:lang w:eastAsia="de-DE"/>
             </w:rPr>
           </w:pPr>
-          <w:hyperlink w:anchor="_Toc243653410" w:history="1">
+          <w:hyperlink w:anchor="_Toc244261983" w:history="1">
             <w:r>
               <w:rPr>
                 <w:rStyle w:val="Hyperlink"/>
@@ -513,7 +513,7 @@
                 <w:noProof/>
                 <w:webHidden/>
               </w:rPr>
-              <w:instrText xml:space="preserve"> PAGEREF _Toc243653410 \h </w:instrText>
+              <w:instrText xml:space="preserve"> PAGEREF _Toc244261983 \h </w:instrText>
             </w:r>
             <w:r>
               <w:rPr>
@@ -555,7 +555,7 @@
               <w:lang w:eastAsia="de-DE"/>
             </w:rPr>
           </w:pPr>
-          <w:hyperlink w:anchor="_Toc243653411" w:history="1">
+          <w:hyperlink w:anchor="_Toc244261984" w:history="1">
             <w:r>
               <w:rPr>
                 <w:rStyle w:val="Hyperlink"/>
@@ -583,7 +583,7 @@
                 <w:noProof/>
                 <w:webHidden/>
               </w:rPr>
-              <w:instrText xml:space="preserve"> PAGEREF _Toc243653411 \h </w:instrText>
+              <w:instrText xml:space="preserve"> PAGEREF _Toc244261984 \h </w:instrText>
             </w:r>
             <w:r>
               <w:rPr>
@@ -625,7 +625,7 @@
               <w:lang w:eastAsia="de-DE"/>
             </w:rPr>
           </w:pPr>
-          <w:hyperlink w:anchor="_Toc243653412" w:history="1">
+          <w:hyperlink w:anchor="_Toc244261985" w:history="1">
             <w:r>
               <w:rPr>
                 <w:rStyle w:val="Hyperlink"/>
@@ -652,7 +652,7 @@
                 <w:noProof/>
                 <w:webHidden/>
               </w:rPr>
-              <w:instrText xml:space="preserve"> PAGEREF _Toc243653412 \h </w:instrText>
+              <w:instrText xml:space="preserve"> PAGEREF _Toc244261985 \h </w:instrText>
             </w:r>
             <w:r>
               <w:rPr>
@@ -694,7 +694,7 @@
               <w:lang w:eastAsia="de-DE"/>
             </w:rPr>
           </w:pPr>
-          <w:hyperlink w:anchor="_Toc243653413" w:history="1">
+          <w:hyperlink w:anchor="_Toc244261986" w:history="1">
             <w:r>
               <w:rPr>
                 <w:rStyle w:val="Hyperlink"/>
@@ -722,7 +722,7 @@
                 <w:noProof/>
                 <w:webHidden/>
               </w:rPr>
-              <w:instrText xml:space="preserve"> PAGEREF _Toc243653413 \h </w:instrText>
+              <w:instrText xml:space="preserve"> PAGEREF _Toc244261986 \h </w:instrText>
             </w:r>
             <w:r>
               <w:rPr>
@@ -767,7 +767,7 @@
               <w:lang w:eastAsia="de-DE"/>
             </w:rPr>
           </w:pPr>
-          <w:hyperlink w:anchor="_Toc243653414" w:history="1">
+          <w:hyperlink w:anchor="_Toc244261987" w:history="1">
             <w:r>
               <w:rPr>
                 <w:rStyle w:val="Hyperlink"/>
@@ -794,7 +794,7 @@
                 <w:noProof/>
                 <w:webHidden/>
               </w:rPr>
-              <w:instrText xml:space="preserve"> PAGEREF _Toc243653414 \h </w:instrText>
+              <w:instrText xml:space="preserve"> PAGEREF _Toc244261987 \h </w:instrText>
             </w:r>
             <w:r>
               <w:rPr>
@@ -839,7 +839,7 @@
               <w:lang w:eastAsia="de-DE"/>
             </w:rPr>
           </w:pPr>
-          <w:hyperlink w:anchor="_Toc243653415" w:history="1">
+          <w:hyperlink w:anchor="_Toc244261988" w:history="1">
             <w:r>
               <w:rPr>
                 <w:rStyle w:val="Hyperlink"/>
@@ -866,7 +866,7 @@
                 <w:noProof/>
                 <w:webHidden/>
               </w:rPr>
-              <w:instrText xml:space="preserve"> PAGEREF _Toc243653415 \h </w:instrText>
+              <w:instrText xml:space="preserve"> PAGEREF _Toc244261988 \h </w:instrText>
             </w:r>
             <w:r>
               <w:rPr>
@@ -911,7 +911,7 @@
               <w:lang w:eastAsia="de-DE"/>
             </w:rPr>
           </w:pPr>
-          <w:hyperlink w:anchor="_Toc243653416" w:history="1">
+          <w:hyperlink w:anchor="_Toc244261989" w:history="1">
             <w:r>
               <w:rPr>
                 <w:rStyle w:val="Hyperlink"/>
@@ -938,7 +938,7 @@
                 <w:noProof/>
                 <w:webHidden/>
               </w:rPr>
-              <w:instrText xml:space="preserve"> PAGEREF _Toc243653416 \h </w:instrText>
+              <w:instrText xml:space="preserve"> PAGEREF _Toc244261989 \h </w:instrText>
             </w:r>
             <w:r>
               <w:rPr>
@@ -980,7 +980,7 @@
               <w:lang w:eastAsia="de-DE"/>
             </w:rPr>
           </w:pPr>
-          <w:hyperlink w:anchor="_Toc243653417" w:history="1">
+          <w:hyperlink w:anchor="_Toc244261990" w:history="1">
             <w:r>
               <w:rPr>
                 <w:rStyle w:val="Hyperlink"/>
@@ -1008,7 +1008,7 @@
                 <w:noProof/>
                 <w:webHidden/>
               </w:rPr>
-              <w:instrText xml:space="preserve"> PAGEREF _Toc243653417 \h </w:instrText>
+              <w:instrText xml:space="preserve"> PAGEREF _Toc244261990 \h </w:instrText>
             </w:r>
             <w:r>
               <w:rPr>
@@ -1053,7 +1053,7 @@
               <w:lang w:eastAsia="de-DE"/>
             </w:rPr>
           </w:pPr>
-          <w:hyperlink w:anchor="_Toc243653418" w:history="1">
+          <w:hyperlink w:anchor="_Toc244261991" w:history="1">
             <w:r>
               <w:rPr>
                 <w:rStyle w:val="Hyperlink"/>
@@ -1080,7 +1080,7 @@
                 <w:noProof/>
                 <w:webHidden/>
               </w:rPr>
-              <w:instrText xml:space="preserve"> PAGEREF _Toc243653418 \h </w:instrText>
+              <w:instrText xml:space="preserve"> PAGEREF _Toc244261991 \h </w:instrText>
             </w:r>
             <w:r>
               <w:rPr>
@@ -1125,7 +1125,7 @@
               <w:lang w:eastAsia="de-DE"/>
             </w:rPr>
           </w:pPr>
-          <w:hyperlink w:anchor="_Toc243653419" w:history="1">
+          <w:hyperlink w:anchor="_Toc244261992" w:history="1">
             <w:r>
               <w:rPr>
                 <w:rStyle w:val="Hyperlink"/>
@@ -1152,7 +1152,7 @@
                 <w:noProof/>
                 <w:webHidden/>
               </w:rPr>
-              <w:instrText xml:space="preserve"> PAGEREF _Toc243653419 \h </w:instrText>
+              <w:instrText xml:space="preserve"> PAGEREF _Toc244261992 \h </w:instrText>
             </w:r>
             <w:r>
               <w:rPr>
@@ -1197,7 +1197,7 @@
               <w:lang w:eastAsia="de-DE"/>
             </w:rPr>
           </w:pPr>
-          <w:hyperlink w:anchor="_Toc243653420" w:history="1">
+          <w:hyperlink w:anchor="_Toc244261993" w:history="1">
             <w:r>
               <w:rPr>
                 <w:rStyle w:val="Hyperlink"/>
@@ -1224,7 +1224,7 @@
                 <w:noProof/>
                 <w:webHidden/>
               </w:rPr>
-              <w:instrText xml:space="preserve"> PAGEREF _Toc243653420 \h </w:instrText>
+              <w:instrText xml:space="preserve"> PAGEREF _Toc244261993 \h </w:instrText>
             </w:r>
             <w:r>
               <w:rPr>
@@ -1269,7 +1269,7 @@
               <w:lang w:eastAsia="de-DE"/>
             </w:rPr>
           </w:pPr>
-          <w:hyperlink w:anchor="_Toc243653421" w:history="1">
+          <w:hyperlink w:anchor="_Toc244261994" w:history="1">
             <w:r>
               <w:rPr>
                 <w:rStyle w:val="Hyperlink"/>
@@ -1296,7 +1296,7 @@
                 <w:noProof/>
                 <w:webHidden/>
               </w:rPr>
-              <w:instrText xml:space="preserve"> PAGEREF _Toc243653421 \h </w:instrText>
+              <w:instrText xml:space="preserve"> PAGEREF _Toc244261994 \h </w:instrText>
             </w:r>
             <w:r>
               <w:rPr>
@@ -1341,7 +1341,7 @@
               <w:lang w:eastAsia="de-DE"/>
             </w:rPr>
           </w:pPr>
-          <w:hyperlink w:anchor="_Toc243653422" w:history="1">
+          <w:hyperlink w:anchor="_Toc244261995" w:history="1">
             <w:r>
               <w:rPr>
                 <w:rStyle w:val="Hyperlink"/>
@@ -1368,7 +1368,7 @@
                 <w:noProof/>
                 <w:webHidden/>
               </w:rPr>
-              <w:instrText xml:space="preserve"> PAGEREF _Toc243653422 \h </w:instrText>
+              <w:instrText xml:space="preserve"> PAGEREF _Toc244261995 \h </w:instrText>
             </w:r>
             <w:r>
               <w:rPr>
@@ -1413,7 +1413,7 @@
               <w:lang w:eastAsia="de-DE"/>
             </w:rPr>
           </w:pPr>
-          <w:hyperlink w:anchor="_Toc243653423" w:history="1">
+          <w:hyperlink w:anchor="_Toc244261996" w:history="1">
             <w:r>
               <w:rPr>
                 <w:rStyle w:val="Hyperlink"/>
@@ -1440,7 +1440,7 @@
                 <w:noProof/>
                 <w:webHidden/>
               </w:rPr>
-              <w:instrText xml:space="preserve"> PAGEREF _Toc243653423 \h </w:instrText>
+              <w:instrText xml:space="preserve"> PAGEREF _Toc244261996 \h </w:instrText>
             </w:r>
             <w:r>
               <w:rPr>
@@ -1485,7 +1485,7 @@
               <w:lang w:eastAsia="de-DE"/>
             </w:rPr>
           </w:pPr>
-          <w:hyperlink w:anchor="_Toc243653424" w:history="1">
+          <w:hyperlink w:anchor="_Toc244261997" w:history="1">
             <w:r>
               <w:rPr>
                 <w:rStyle w:val="Hyperlink"/>
@@ -1512,7 +1512,7 @@
                 <w:noProof/>
                 <w:webHidden/>
               </w:rPr>
-              <w:instrText xml:space="preserve"> PAGEREF _Toc243653424 \h </w:instrText>
+              <w:instrText xml:space="preserve"> PAGEREF _Toc244261997 \h </w:instrText>
             </w:r>
             <w:r>
               <w:rPr>
@@ -1557,7 +1557,7 @@
               <w:lang w:eastAsia="de-DE"/>
             </w:rPr>
           </w:pPr>
-          <w:hyperlink w:anchor="_Toc243653425" w:history="1">
+          <w:hyperlink w:anchor="_Toc244261998" w:history="1">
             <w:r>
               <w:rPr>
                 <w:rStyle w:val="Hyperlink"/>
@@ -1584,7 +1584,7 @@
                 <w:noProof/>
                 <w:webHidden/>
               </w:rPr>
-              <w:instrText xml:space="preserve"> PAGEREF _Toc243653425 \h </w:instrText>
+              <w:instrText xml:space="preserve"> PAGEREF _Toc244261998 \h </w:instrText>
             </w:r>
             <w:r>
               <w:rPr>
@@ -1629,7 +1629,7 @@
               <w:lang w:eastAsia="de-DE"/>
             </w:rPr>
           </w:pPr>
-          <w:hyperlink w:anchor="_Toc243653426" w:history="1">
+          <w:hyperlink w:anchor="_Toc244261999" w:history="1">
             <w:r>
               <w:rPr>
                 <w:rStyle w:val="Hyperlink"/>
@@ -1656,7 +1656,7 @@
                 <w:noProof/>
                 <w:webHidden/>
               </w:rPr>
-              <w:instrText xml:space="preserve"> PAGEREF _Toc243653426 \h </w:instrText>
+              <w:instrText xml:space="preserve"> PAGEREF _Toc244261999 \h </w:instrText>
             </w:r>
             <w:r>
               <w:rPr>
@@ -1701,7 +1701,7 @@
               <w:lang w:eastAsia="de-DE"/>
             </w:rPr>
           </w:pPr>
-          <w:hyperlink w:anchor="_Toc243653427" w:history="1">
+          <w:hyperlink w:anchor="_Toc244262000" w:history="1">
             <w:r>
               <w:rPr>
                 <w:rStyle w:val="Hyperlink"/>
@@ -1728,7 +1728,7 @@
                 <w:noProof/>
                 <w:webHidden/>
               </w:rPr>
-              <w:instrText xml:space="preserve"> PAGEREF _Toc243653427 \h </w:instrText>
+              <w:instrText xml:space="preserve"> PAGEREF _Toc244262000 \h </w:instrText>
             </w:r>
             <w:r>
               <w:rPr>
@@ -1770,7 +1770,7 @@
               <w:lang w:eastAsia="de-DE"/>
             </w:rPr>
           </w:pPr>
-          <w:hyperlink w:anchor="_Toc243653428" w:history="1">
+          <w:hyperlink w:anchor="_Toc244262001" w:history="1">
             <w:r>
               <w:rPr>
                 <w:rStyle w:val="Hyperlink"/>
@@ -1798,7 +1798,7 @@
                 <w:noProof/>
                 <w:webHidden/>
               </w:rPr>
-              <w:instrText xml:space="preserve"> PAGEREF _Toc243653428 \h </w:instrText>
+              <w:instrText xml:space="preserve"> PAGEREF _Toc244262001 \h </w:instrText>
             </w:r>
             <w:r>
               <w:rPr>
@@ -1840,7 +1840,7 @@
               <w:lang w:eastAsia="de-DE"/>
             </w:rPr>
           </w:pPr>
-          <w:hyperlink w:anchor="_Toc243653429" w:history="1">
+          <w:hyperlink w:anchor="_Toc244262002" w:history="1">
             <w:r>
               <w:rPr>
                 <w:rStyle w:val="Hyperlink"/>
@@ -1868,7 +1868,7 @@
                 <w:noProof/>
                 <w:webHidden/>
               </w:rPr>
-              <w:instrText xml:space="preserve"> PAGEREF _Toc243653429 \h </w:instrText>
+              <w:instrText xml:space="preserve"> PAGEREF _Toc244262002 \h </w:instrText>
             </w:r>
             <w:r>
               <w:rPr>
@@ -1939,7 +1939,7 @@
       <w:pPr>
         <w:pStyle w:val="berschrift1"/>
       </w:pPr>
-      <w:bookmarkStart w:id="0" w:name="_Toc243653409"/>
+      <w:bookmarkStart w:id="0" w:name="_Toc244261982"/>
       <w:r>
         <w:lastRenderedPageBreak/>
         <w:t>Abbildungsverzeichnis</w:t>
@@ -1969,7 +1969,7 @@
       <w:r>
         <w:fldChar w:fldCharType="separate"/>
       </w:r>
-      <w:hyperlink w:anchor="_Toc243653404" w:history="1">
+      <w:hyperlink w:anchor="_Toc244262003" w:history="1">
         <w:r>
           <w:rPr>
             <w:rStyle w:val="Hyperlink"/>
@@ -1996,7 +1996,7 @@
             <w:noProof/>
             <w:webHidden/>
           </w:rPr>
-          <w:instrText xml:space="preserve"> PAGEREF _Toc243653404 \h </w:instrText>
+          <w:instrText xml:space="preserve"> PAGEREF _Toc244262003 \h </w:instrText>
         </w:r>
         <w:r>
           <w:rPr>
@@ -2054,7 +2054,7 @@
           <w:rFonts w:cs="Arial"/>
         </w:rPr>
       </w:pPr>
-      <w:bookmarkStart w:id="1" w:name="_Toc243653410"/>
+      <w:bookmarkStart w:id="1" w:name="_Toc244261983"/>
       <w:r>
         <w:rPr>
           <w:rFonts w:cs="Arial"/>
@@ -2094,13 +2094,20 @@
       <w:r>
         <w:fldChar w:fldCharType="separate"/>
       </w:r>
-      <w:hyperlink w:anchor="_Toc241412959" w:history="1">
+      <w:hyperlink w:anchor="_Toc244262004" w:history="1">
         <w:r>
           <w:rPr>
             <w:rStyle w:val="Hyperlink"/>
             <w:noProof/>
           </w:rPr>
-          <w:t>Tabelle 1: FA-01-04</w:t>
+          <w:t>Tabelle 1: FA-01-0</w:t>
+        </w:r>
+        <w:r>
+          <w:rPr>
+            <w:rStyle w:val="Hyperlink"/>
+            <w:noProof/>
+          </w:rPr>
+          <w:t>5</w:t>
         </w:r>
         <w:r>
           <w:rPr>
@@ -2121,7 +2128,7 @@
             <w:noProof/>
             <w:webHidden/>
           </w:rPr>
-          <w:instrText xml:space="preserve"> PAGEREF _Toc241412959 \h </w:instrText>
+          <w:instrText xml:space="preserve"> PAGEREF _Toc244262004 \h </w:instrText>
         </w:r>
         <w:r>
           <w:rPr>
@@ -2166,13 +2173,13 @@
           <w:lang w:eastAsia="de-DE"/>
         </w:rPr>
       </w:pPr>
-      <w:hyperlink w:anchor="_Toc241412960" w:history="1">
+      <w:hyperlink w:anchor="_Toc244262005" w:history="1">
         <w:r>
           <w:rPr>
             <w:rStyle w:val="Hyperlink"/>
             <w:noProof/>
           </w:rPr>
-          <w:t>Tabelle 2: FA-05-09</w:t>
+          <w:t>Tabelle 2: FA-06-10</w:t>
         </w:r>
         <w:r>
           <w:rPr>
@@ -2193,7 +2200,7 @@
             <w:noProof/>
             <w:webHidden/>
           </w:rPr>
-          <w:instrText xml:space="preserve"> PAGEREF _Toc241412960 \h </w:instrText>
+          <w:instrText xml:space="preserve"> PAGEREF _Toc244262005 \h </w:instrText>
         </w:r>
         <w:r>
           <w:rPr>
@@ -2238,13 +2245,13 @@
           <w:lang w:eastAsia="de-DE"/>
         </w:rPr>
       </w:pPr>
-      <w:hyperlink w:anchor="_Toc241412961" w:history="1">
+      <w:hyperlink w:anchor="_Toc244262006" w:history="1">
         <w:r>
           <w:rPr>
             <w:rStyle w:val="Hyperlink"/>
             <w:noProof/>
           </w:rPr>
-          <w:t>Tabelle 3: FA-10-12</w:t>
+          <w:t>Tabelle 3: FA-11-13</w:t>
         </w:r>
         <w:r>
           <w:rPr>
@@ -2265,7 +2272,7 @@
             <w:noProof/>
             <w:webHidden/>
           </w:rPr>
-          <w:instrText xml:space="preserve"> PAGEREF _Toc241412961 \h </w:instrText>
+          <w:instrText xml:space="preserve"> PAGEREF _Toc244262006 \h </w:instrText>
         </w:r>
         <w:r>
           <w:rPr>
@@ -2310,13 +2317,13 @@
           <w:lang w:eastAsia="de-DE"/>
         </w:rPr>
       </w:pPr>
-      <w:hyperlink w:anchor="_Toc241412962" w:history="1">
+      <w:hyperlink w:anchor="_Toc244262007" w:history="1">
         <w:r>
           <w:rPr>
             <w:rStyle w:val="Hyperlink"/>
             <w:noProof/>
           </w:rPr>
-          <w:t>Tabelle 4: FA-13-15</w:t>
+          <w:t>Tabelle 4: FA-14-16</w:t>
         </w:r>
         <w:r>
           <w:rPr>
@@ -2337,7 +2344,7 @@
             <w:noProof/>
             <w:webHidden/>
           </w:rPr>
-          <w:instrText xml:space="preserve"> PAGEREF _Toc241412962 \h </w:instrText>
+          <w:instrText xml:space="preserve"> PAGEREF _Toc244262007 \h </w:instrText>
         </w:r>
         <w:r>
           <w:rPr>
@@ -2382,13 +2389,13 @@
           <w:lang w:eastAsia="de-DE"/>
         </w:rPr>
       </w:pPr>
-      <w:hyperlink w:anchor="_Toc241412963" w:history="1">
+      <w:hyperlink w:anchor="_Toc244262008" w:history="1">
         <w:r>
           <w:rPr>
             <w:rStyle w:val="Hyperlink"/>
             <w:noProof/>
           </w:rPr>
-          <w:t>Tabelle 5: FA-16-19</w:t>
+          <w:t>Tabelle 5: FA-17-20</w:t>
         </w:r>
         <w:r>
           <w:rPr>
@@ -2409,7 +2416,7 @@
             <w:noProof/>
             <w:webHidden/>
           </w:rPr>
-          <w:instrText xml:space="preserve"> PAGEREF _Toc241412963 \h </w:instrText>
+          <w:instrText xml:space="preserve"> PAGEREF _Toc244262008 \h </w:instrText>
         </w:r>
         <w:r>
           <w:rPr>
@@ -2454,13 +2461,13 @@
           <w:lang w:eastAsia="de-DE"/>
         </w:rPr>
       </w:pPr>
-      <w:hyperlink w:anchor="_Toc241412964" w:history="1">
+      <w:hyperlink w:anchor="_Toc244262009" w:history="1">
         <w:r>
           <w:rPr>
             <w:rStyle w:val="Hyperlink"/>
             <w:noProof/>
           </w:rPr>
-          <w:t>Tabelle 6: FA-20-21</w:t>
+          <w:t>Tabelle 6: FA-21-22</w:t>
         </w:r>
         <w:r>
           <w:rPr>
@@ -2481,7 +2488,7 @@
             <w:noProof/>
             <w:webHidden/>
           </w:rPr>
-          <w:instrText xml:space="preserve"> PAGEREF _Toc241412964 \h </w:instrText>
+          <w:instrText xml:space="preserve"> PAGEREF _Toc244262009 \h </w:instrText>
         </w:r>
         <w:r>
           <w:rPr>
@@ -2526,13 +2533,13 @@
           <w:lang w:eastAsia="de-DE"/>
         </w:rPr>
       </w:pPr>
-      <w:hyperlink w:anchor="_Toc241412965" w:history="1">
+      <w:hyperlink w:anchor="_Toc244262010" w:history="1">
         <w:r>
           <w:rPr>
             <w:rStyle w:val="Hyperlink"/>
             <w:noProof/>
           </w:rPr>
-          <w:t>Tabelle 7: FA-22-24</w:t>
+          <w:t>Tabelle 7: FA-23-25</w:t>
         </w:r>
         <w:r>
           <w:rPr>
@@ -2553,7 +2560,7 @@
             <w:noProof/>
             <w:webHidden/>
           </w:rPr>
-          <w:instrText xml:space="preserve"> PAGEREF _Toc241412965 \h </w:instrText>
+          <w:instrText xml:space="preserve"> PAGEREF _Toc244262010 \h </w:instrText>
         </w:r>
         <w:r>
           <w:rPr>
@@ -2598,13 +2605,13 @@
           <w:lang w:eastAsia="de-DE"/>
         </w:rPr>
       </w:pPr>
-      <w:hyperlink w:anchor="_Toc241412966" w:history="1">
+      <w:hyperlink w:anchor="_Toc244262011" w:history="1">
         <w:r>
           <w:rPr>
             <w:rStyle w:val="Hyperlink"/>
             <w:noProof/>
           </w:rPr>
-          <w:t>Tabelle 8: FA-25-27</w:t>
+          <w:t>Tabelle 8: FA-26-28</w:t>
         </w:r>
         <w:r>
           <w:rPr>
@@ -2625,7 +2632,7 @@
             <w:noProof/>
             <w:webHidden/>
           </w:rPr>
-          <w:instrText xml:space="preserve"> PAGEREF _Toc241412966 \h </w:instrText>
+          <w:instrText xml:space="preserve"> PAGEREF _Toc244262011 \h </w:instrText>
         </w:r>
         <w:r>
           <w:rPr>
@@ -2670,13 +2677,13 @@
           <w:lang w:eastAsia="de-DE"/>
         </w:rPr>
       </w:pPr>
-      <w:hyperlink w:anchor="_Toc241412967" w:history="1">
+      <w:hyperlink w:anchor="_Toc244262012" w:history="1">
         <w:r>
           <w:rPr>
             <w:rStyle w:val="Hyperlink"/>
             <w:noProof/>
           </w:rPr>
-          <w:t>Tabelle 9: FA-28-29</w:t>
+          <w:t>Tabelle 9: FA-29-30</w:t>
         </w:r>
         <w:r>
           <w:rPr>
@@ -2697,7 +2704,7 @@
             <w:noProof/>
             <w:webHidden/>
           </w:rPr>
-          <w:instrText xml:space="preserve"> PAGEREF _Toc241412967 \h </w:instrText>
+          <w:instrText xml:space="preserve"> PAGEREF _Toc244262012 \h </w:instrText>
         </w:r>
         <w:r>
           <w:rPr>
@@ -2742,13 +2749,13 @@
           <w:lang w:eastAsia="de-DE"/>
         </w:rPr>
       </w:pPr>
-      <w:hyperlink w:anchor="_Toc241412968" w:history="1">
+      <w:hyperlink w:anchor="_Toc244262013" w:history="1">
         <w:r>
           <w:rPr>
             <w:rStyle w:val="Hyperlink"/>
             <w:noProof/>
           </w:rPr>
-          <w:t>Tabelle 10: NFA-01-13</w:t>
+          <w:t>Tabelle 10: NFA-01-14</w:t>
         </w:r>
         <w:r>
           <w:rPr>
@@ -2769,7 +2776,7 @@
             <w:noProof/>
             <w:webHidden/>
           </w:rPr>
-          <w:instrText xml:space="preserve"> PAGEREF _Toc241412968 \h </w:instrText>
+          <w:instrText xml:space="preserve"> PAGEREF _Toc244262013 \h </w:instrText>
         </w:r>
         <w:r>
           <w:rPr>
@@ -2814,7 +2821,7 @@
           <w:lang w:eastAsia="de-DE"/>
         </w:rPr>
       </w:pPr>
-      <w:hyperlink w:anchor="_Toc241412969" w:history="1">
+      <w:hyperlink w:anchor="_Toc244262014" w:history="1">
         <w:r>
           <w:rPr>
             <w:rStyle w:val="Hyperlink"/>
@@ -2841,7 +2848,7 @@
             <w:noProof/>
             <w:webHidden/>
           </w:rPr>
-          <w:instrText xml:space="preserve"> PAGEREF _Toc241412969 \h </w:instrText>
+          <w:instrText xml:space="preserve"> PAGEREF _Toc244262014 \h </w:instrText>
         </w:r>
         <w:r>
           <w:rPr>
@@ -2902,7 +2909,7 @@
           <w:rFonts w:cs="Arial"/>
         </w:rPr>
       </w:pPr>
-      <w:bookmarkStart w:id="3" w:name="_Toc243653411"/>
+      <w:bookmarkStart w:id="3" w:name="_Toc244261984"/>
       <w:r>
         <w:rPr>
           <w:rFonts w:cs="Arial"/>
@@ -2982,7 +2989,7 @@
       </w:pPr>
       <w:bookmarkStart w:id="4" w:name="_Toc192768108"/>
       <w:bookmarkStart w:id="5" w:name="_Toc202101948"/>
-      <w:bookmarkStart w:id="6" w:name="_Toc243653412"/>
+      <w:bookmarkStart w:id="6" w:name="_Toc244261985"/>
       <w:r>
         <w:lastRenderedPageBreak/>
         <w:t xml:space="preserve">1. </w:t>
@@ -3037,7 +3044,7 @@
           <w:rFonts w:cs="Arial"/>
         </w:rPr>
       </w:pPr>
-      <w:bookmarkStart w:id="7" w:name="_Toc243653413"/>
+      <w:bookmarkStart w:id="7" w:name="_Toc244261986"/>
       <w:r>
         <w:rPr>
           <w:rFonts w:cs="Arial"/>
@@ -3069,7 +3076,7 @@
       <w:pPr>
         <w:pStyle w:val="berschrift2"/>
       </w:pPr>
-      <w:bookmarkStart w:id="8" w:name="_Toc243653414"/>
+      <w:bookmarkStart w:id="8" w:name="_Toc244261987"/>
       <w:r>
         <w:t>2</w:t>
       </w:r>
@@ -3178,7 +3185,7 @@
       <w:pPr>
         <w:pStyle w:val="berschrift2"/>
       </w:pPr>
-      <w:bookmarkStart w:id="9" w:name="_Toc243653415"/>
+      <w:bookmarkStart w:id="9" w:name="_Toc244261988"/>
       <w:r>
         <w:lastRenderedPageBreak/>
         <w:t>2.</w:t>
@@ -3312,12 +3319,12 @@
       <w:r>
         <w:t>stabile Anwendung ohne unerwartete Abbrüche</w:t>
       </w:r>
-      <w:bookmarkStart w:id="10" w:name="_Toc243653416"/>
     </w:p>
     <w:p>
       <w:pPr>
         <w:pStyle w:val="berschrift2"/>
       </w:pPr>
+      <w:bookmarkStart w:id="10" w:name="_Toc244261989"/>
       <w:r>
         <w:t>2.</w:t>
       </w:r>
@@ -3414,7 +3421,7 @@
           <w:rFonts w:cs="Arial"/>
         </w:rPr>
       </w:pPr>
-      <w:bookmarkStart w:id="11" w:name="_Toc243653417"/>
+      <w:bookmarkStart w:id="11" w:name="_Toc244261990"/>
       <w:r>
         <w:rPr>
           <w:rFonts w:cs="Arial"/>
@@ -3456,7 +3463,7 @@
       <w:pPr>
         <w:pStyle w:val="berschrift2"/>
       </w:pPr>
-      <w:bookmarkStart w:id="12" w:name="_Toc243653418"/>
+      <w:bookmarkStart w:id="12" w:name="_Toc244261991"/>
       <w:r>
         <w:t xml:space="preserve">3.1 </w:t>
       </w:r>
@@ -3474,7 +3481,7 @@
           <w:szCs w:val="22"/>
         </w:rPr>
       </w:pPr>
-      <w:bookmarkStart w:id="13" w:name="_Toc241412959"/>
+      <w:bookmarkStart w:id="13" w:name="_Toc244262004"/>
       <w:r>
         <w:rPr>
           <w:sz w:val="22"/>
@@ -3525,7 +3532,6 @@
         </w:rPr>
         <w:t>: FA-01-0</w:t>
       </w:r>
-      <w:bookmarkEnd w:id="13"/>
       <w:r>
         <w:rPr>
           <w:sz w:val="22"/>
@@ -3533,6 +3539,7 @@
         </w:rPr>
         <w:t>5</w:t>
       </w:r>
+      <w:bookmarkEnd w:id="13"/>
     </w:p>
     <w:tbl>
       <w:tblPr>
@@ -3755,7 +3762,13 @@
         </w:tabs>
       </w:pPr>
       <w:r>
-        <w:t>Quelle. Eigene Darstellung</w:t>
+        <w:t>Quelle</w:t>
+      </w:r>
+      <w:r>
+        <w:t>:</w:t>
+      </w:r>
+      <w:r>
+        <w:t xml:space="preserve"> Eigene Darstellung</w:t>
       </w:r>
     </w:p>
     <w:p>
@@ -3881,7 +3894,7 @@
       <w:pPr>
         <w:pStyle w:val="berschrift2"/>
       </w:pPr>
-      <w:bookmarkStart w:id="14" w:name="_Toc243653419"/>
+      <w:bookmarkStart w:id="14" w:name="_Toc244261992"/>
       <w:r>
         <w:lastRenderedPageBreak/>
         <w:t>3.2 Spielfeld</w:t>
@@ -3897,7 +3910,7 @@
           <w:szCs w:val="22"/>
         </w:rPr>
       </w:pPr>
-      <w:bookmarkStart w:id="15" w:name="_Toc241412960"/>
+      <w:bookmarkStart w:id="15" w:name="_Toc244262005"/>
       <w:r>
         <w:rPr>
           <w:sz w:val="22"/>
@@ -3976,7 +3989,6 @@
         </w:rPr>
         <w:t>-</w:t>
       </w:r>
-      <w:bookmarkEnd w:id="15"/>
       <w:r>
         <w:rPr>
           <w:sz w:val="22"/>
@@ -3984,6 +3996,7 @@
         </w:rPr>
         <w:t>10</w:t>
       </w:r>
+      <w:bookmarkEnd w:id="15"/>
     </w:p>
     <w:tbl>
       <w:tblPr>
@@ -4198,7 +4211,13 @@
         </w:tabs>
       </w:pPr>
       <w:r>
-        <w:t>Quelle. Eigene Darstellung</w:t>
+        <w:t>Quelle</w:t>
+      </w:r>
+      <w:r>
+        <w:t>:</w:t>
+      </w:r>
+      <w:r>
+        <w:t xml:space="preserve"> Eigene Darstellung</w:t>
       </w:r>
     </w:p>
     <w:p>
@@ -4294,7 +4313,7 @@
       <w:pPr>
         <w:pStyle w:val="berschrift2"/>
       </w:pPr>
-      <w:bookmarkStart w:id="16" w:name="_Toc243653420"/>
+      <w:bookmarkStart w:id="16" w:name="_Toc244261993"/>
       <w:r>
         <w:t>3.3 Bewegung der Spielfiguren</w:t>
       </w:r>
@@ -4309,7 +4328,7 @@
           <w:szCs w:val="22"/>
         </w:rPr>
       </w:pPr>
-      <w:bookmarkStart w:id="17" w:name="_Toc241412961"/>
+      <w:bookmarkStart w:id="17" w:name="_Toc244262006"/>
       <w:r>
         <w:rPr>
           <w:sz w:val="22"/>
@@ -4395,7 +4414,6 @@
         </w:rPr>
         <w:t>1</w:t>
       </w:r>
-      <w:bookmarkEnd w:id="17"/>
       <w:r>
         <w:rPr>
           <w:sz w:val="22"/>
@@ -4403,6 +4421,7 @@
         </w:rPr>
         <w:t>3</w:t>
       </w:r>
+      <w:bookmarkEnd w:id="17"/>
     </w:p>
     <w:tbl>
       <w:tblPr>
@@ -4557,7 +4576,10 @@
         </w:tabs>
       </w:pPr>
       <w:r>
-        <w:t>Quelle. Eigene Darstellung</w:t>
+        <w:t>Quelle:</w:t>
+      </w:r>
+      <w:r>
+        <w:t xml:space="preserve"> Eigene Darstellung</w:t>
       </w:r>
     </w:p>
     <w:p>
@@ -4635,7 +4657,7 @@
       <w:pPr>
         <w:pStyle w:val="berschrift2"/>
       </w:pPr>
-      <w:bookmarkStart w:id="18" w:name="_Toc243653421"/>
+      <w:bookmarkStart w:id="18" w:name="_Toc244261994"/>
       <w:r>
         <w:t>3.4 Zielkarten und Artefakte</w:t>
       </w:r>
@@ -4650,7 +4672,7 @@
           <w:szCs w:val="22"/>
         </w:rPr>
       </w:pPr>
-      <w:bookmarkStart w:id="19" w:name="_Toc241412962"/>
+      <w:bookmarkStart w:id="19" w:name="_Toc244262007"/>
       <w:r>
         <w:rPr>
           <w:sz w:val="22"/>
@@ -4715,7 +4737,6 @@
         </w:rPr>
         <w:t>-1</w:t>
       </w:r>
-      <w:bookmarkEnd w:id="19"/>
       <w:r>
         <w:rPr>
           <w:sz w:val="22"/>
@@ -4723,6 +4744,7 @@
         </w:rPr>
         <w:t>6</w:t>
       </w:r>
+      <w:bookmarkEnd w:id="19"/>
     </w:p>
     <w:tbl>
       <w:tblPr>
@@ -4883,7 +4905,10 @@
         </w:tabs>
       </w:pPr>
       <w:r>
-        <w:t>Quelle. Eigene Darstellung</w:t>
+        <w:t>Quelle:</w:t>
+      </w:r>
+      <w:r>
+        <w:t xml:space="preserve"> Eigene Darstellung</w:t>
       </w:r>
     </w:p>
     <w:p>
@@ -4943,7 +4968,7 @@
       <w:pPr>
         <w:pStyle w:val="berschrift2"/>
       </w:pPr>
-      <w:bookmarkStart w:id="20" w:name="_Toc243653422"/>
+      <w:bookmarkStart w:id="20" w:name="_Toc244261995"/>
       <w:r>
         <w:t>3.5 Spezialkachel Portal</w:t>
       </w:r>
@@ -4961,7 +4986,7 @@
           <w:szCs w:val="22"/>
         </w:rPr>
       </w:pPr>
-      <w:bookmarkStart w:id="21" w:name="_Toc241412963"/>
+      <w:bookmarkStart w:id="21" w:name="_Toc244262008"/>
       <w:r>
         <w:rPr>
           <w:sz w:val="22"/>
@@ -5026,7 +5051,6 @@
         </w:rPr>
         <w:t>-</w:t>
       </w:r>
-      <w:bookmarkEnd w:id="21"/>
       <w:r>
         <w:rPr>
           <w:sz w:val="22"/>
@@ -5034,6 +5058,7 @@
         </w:rPr>
         <w:t>20</w:t>
       </w:r>
+      <w:bookmarkEnd w:id="21"/>
     </w:p>
     <w:tbl>
       <w:tblPr>
@@ -5217,7 +5242,10 @@
         </w:tabs>
       </w:pPr>
       <w:r>
-        <w:t>Quelle. Eigene Darstellung</w:t>
+        <w:t>Quelle:</w:t>
+      </w:r>
+      <w:r>
+        <w:t xml:space="preserve"> Eigene Darstellung</w:t>
       </w:r>
     </w:p>
     <w:p>
@@ -5332,7 +5360,7 @@
       <w:pPr>
         <w:pStyle w:val="berschrift2"/>
       </w:pPr>
-      <w:bookmarkStart w:id="22" w:name="_Toc243653423"/>
+      <w:bookmarkStart w:id="22" w:name="_Toc244261996"/>
       <w:r>
         <w:t>3.</w:t>
       </w:r>
@@ -5353,7 +5381,7 @@
           <w:szCs w:val="22"/>
         </w:rPr>
       </w:pPr>
-      <w:bookmarkStart w:id="23" w:name="_Toc241412964"/>
+      <w:bookmarkStart w:id="23" w:name="_Toc244262009"/>
       <w:r>
         <w:rPr>
           <w:sz w:val="22"/>
@@ -5418,7 +5446,6 @@
         </w:rPr>
         <w:t>-2</w:t>
       </w:r>
-      <w:bookmarkEnd w:id="23"/>
       <w:r>
         <w:rPr>
           <w:sz w:val="22"/>
@@ -5426,6 +5453,7 @@
         </w:rPr>
         <w:t>2</w:t>
       </w:r>
+      <w:bookmarkEnd w:id="23"/>
     </w:p>
     <w:tbl>
       <w:tblPr>
@@ -5553,7 +5581,10 @@
         </w:tabs>
       </w:pPr>
       <w:r>
-        <w:t>Quelle. Eigene Darstellung</w:t>
+        <w:t>Quelle:</w:t>
+      </w:r>
+      <w:r>
+        <w:t xml:space="preserve"> Eigene Darstellung</w:t>
       </w:r>
     </w:p>
     <w:p>
@@ -5670,7 +5701,7 @@
       <w:pPr>
         <w:pStyle w:val="berschrift2"/>
       </w:pPr>
-      <w:bookmarkStart w:id="24" w:name="_Toc243653424"/>
+      <w:bookmarkStart w:id="24" w:name="_Toc244261997"/>
       <w:r>
         <w:lastRenderedPageBreak/>
         <w:t>3.</w:t>
@@ -5692,7 +5723,7 @@
           <w:szCs w:val="22"/>
         </w:rPr>
       </w:pPr>
-      <w:bookmarkStart w:id="25" w:name="_Toc241412965"/>
+      <w:bookmarkStart w:id="25" w:name="_Toc244262010"/>
       <w:r>
         <w:rPr>
           <w:sz w:val="22"/>
@@ -5757,7 +5788,6 @@
         </w:rPr>
         <w:t>-2</w:t>
       </w:r>
-      <w:bookmarkEnd w:id="25"/>
       <w:r>
         <w:rPr>
           <w:sz w:val="22"/>
@@ -5765,6 +5795,7 @@
         </w:rPr>
         <w:t>5</w:t>
       </w:r>
+      <w:bookmarkEnd w:id="25"/>
     </w:p>
     <w:tbl>
       <w:tblPr>
@@ -5922,7 +5953,10 @@
         </w:tabs>
       </w:pPr>
       <w:r>
-        <w:t>Quelle. Eigene Darstellung</w:t>
+        <w:t>Quelle:</w:t>
+      </w:r>
+      <w:r>
+        <w:t xml:space="preserve"> Eigene Darstellung</w:t>
       </w:r>
     </w:p>
     <w:p>
@@ -5985,7 +6019,7 @@
       <w:pPr>
         <w:pStyle w:val="berschrift2"/>
       </w:pPr>
-      <w:bookmarkStart w:id="26" w:name="_Toc243653425"/>
+      <w:bookmarkStart w:id="26" w:name="_Toc244261998"/>
       <w:r>
         <w:t>3.</w:t>
       </w:r>
@@ -6009,7 +6043,7 @@
           <w:szCs w:val="22"/>
         </w:rPr>
       </w:pPr>
-      <w:bookmarkStart w:id="27" w:name="_Toc241412966"/>
+      <w:bookmarkStart w:id="27" w:name="_Toc244262011"/>
       <w:r>
         <w:rPr>
           <w:sz w:val="22"/>
@@ -6074,7 +6108,6 @@
         </w:rPr>
         <w:t>-2</w:t>
       </w:r>
-      <w:bookmarkEnd w:id="27"/>
       <w:r>
         <w:rPr>
           <w:sz w:val="22"/>
@@ -6082,6 +6115,7 @@
         </w:rPr>
         <w:t>8</w:t>
       </w:r>
+      <w:bookmarkEnd w:id="27"/>
     </w:p>
     <w:tbl>
       <w:tblPr>
@@ -6236,7 +6270,10 @@
         </w:tabs>
       </w:pPr>
       <w:r>
-        <w:t>Quelle. Eigene Darstellung</w:t>
+        <w:t>Quelle:</w:t>
+      </w:r>
+      <w:r>
+        <w:t xml:space="preserve"> Eigene Darstellung</w:t>
       </w:r>
     </w:p>
     <w:p>
@@ -6294,7 +6331,7 @@
           <w:rFonts w:ascii="Times New Roman" w:hAnsi="Times New Roman"/>
         </w:rPr>
       </w:pPr>
-      <w:bookmarkStart w:id="28" w:name="_Toc243653426"/>
+      <w:bookmarkStart w:id="28" w:name="_Toc244261999"/>
       <w:r>
         <w:lastRenderedPageBreak/>
         <w:t>3.9 Siegbedingung und Spielende</w:t>
@@ -6310,7 +6347,7 @@
           <w:szCs w:val="22"/>
         </w:rPr>
       </w:pPr>
-      <w:bookmarkStart w:id="29" w:name="_Toc241412967"/>
+      <w:bookmarkStart w:id="29" w:name="_Toc244262012"/>
       <w:r>
         <w:rPr>
           <w:sz w:val="22"/>
@@ -6375,7 +6412,6 @@
         </w:rPr>
         <w:t>-</w:t>
       </w:r>
-      <w:bookmarkEnd w:id="29"/>
       <w:r>
         <w:rPr>
           <w:sz w:val="22"/>
@@ -6383,6 +6419,7 @@
         </w:rPr>
         <w:t>30</w:t>
       </w:r>
+      <w:bookmarkEnd w:id="29"/>
     </w:p>
     <w:tbl>
       <w:tblPr>
@@ -6531,7 +6568,13 @@
         </w:tabs>
       </w:pPr>
       <w:r>
-        <w:t>Quelle. Eigene Darstellung</w:t>
+        <w:t>Quelle</w:t>
+      </w:r>
+      <w:r>
+        <w:t>:</w:t>
+      </w:r>
+      <w:r>
+        <w:t xml:space="preserve"> Eigene Darstellung</w:t>
       </w:r>
     </w:p>
     <w:p>
@@ -6606,7 +6649,7 @@
       <w:pPr>
         <w:pStyle w:val="berschrift2"/>
       </w:pPr>
-      <w:bookmarkStart w:id="30" w:name="_Toc243653427"/>
+      <w:bookmarkStart w:id="30" w:name="_Toc244262000"/>
       <w:r>
         <w:t>3.10 UML-Use-Case-Diagramm</w:t>
       </w:r>
@@ -6733,7 +6776,7 @@
         <w:keepNext/>
       </w:pPr>
       <w:bookmarkStart w:id="31" w:name="_Toc241407898"/>
-      <w:bookmarkStart w:id="32" w:name="_Toc243653404"/>
+      <w:bookmarkStart w:id="32" w:name="_Toc244262003"/>
       <w:r>
         <w:rPr>
           <w:sz w:val="22"/>
@@ -6843,7 +6886,13 @@
         </w:tabs>
       </w:pPr>
       <w:r>
-        <w:t>Quelle. Eigene Darstellung</w:t>
+        <w:t>Quelle</w:t>
+      </w:r>
+      <w:r>
+        <w:t>:</w:t>
+      </w:r>
+      <w:r>
+        <w:t xml:space="preserve"> Eigene Darstellung</w:t>
       </w:r>
     </w:p>
     <w:p>
@@ -6853,7 +6902,7 @@
           <w:rFonts w:cs="Arial"/>
         </w:rPr>
       </w:pPr>
-      <w:bookmarkStart w:id="33" w:name="_Toc243653428"/>
+      <w:bookmarkStart w:id="33" w:name="_Toc244262001"/>
       <w:r>
         <w:rPr>
           <w:rFonts w:cs="Arial"/>
@@ -6910,7 +6959,7 @@
           <w:szCs w:val="22"/>
         </w:rPr>
       </w:pPr>
-      <w:bookmarkStart w:id="34" w:name="_Toc241412968"/>
+      <w:bookmarkStart w:id="34" w:name="_Toc244262013"/>
       <w:r>
         <w:rPr>
           <w:sz w:val="22"/>
@@ -6968,7 +7017,6 @@
         </w:rPr>
         <w:t>-01-1</w:t>
       </w:r>
-      <w:bookmarkEnd w:id="34"/>
       <w:r>
         <w:rPr>
           <w:sz w:val="22"/>
@@ -6976,6 +7024,7 @@
         </w:rPr>
         <w:t>4</w:t>
       </w:r>
+      <w:bookmarkEnd w:id="34"/>
     </w:p>
     <w:tbl>
       <w:tblPr>
@@ -7543,7 +7592,13 @@
         </w:tabs>
       </w:pPr>
       <w:r>
-        <w:t>Quelle. Eigene Darstellung</w:t>
+        <w:t>Quelle</w:t>
+      </w:r>
+      <w:r>
+        <w:t>:</w:t>
+      </w:r>
+      <w:r>
+        <w:t xml:space="preserve"> Eigene Darstellung</w:t>
       </w:r>
     </w:p>
     <w:p>
@@ -7553,7 +7608,7 @@
           <w:rFonts w:cs="Arial"/>
         </w:rPr>
       </w:pPr>
-      <w:bookmarkStart w:id="35" w:name="_Toc243653429"/>
+      <w:bookmarkStart w:id="35" w:name="_Toc244262002"/>
       <w:r>
         <w:rPr>
           <w:rFonts w:cs="Arial"/>
@@ -7636,7 +7691,7 @@
           <w:szCs w:val="22"/>
         </w:rPr>
       </w:pPr>
-      <w:bookmarkStart w:id="36" w:name="_Toc241412969"/>
+      <w:bookmarkStart w:id="36" w:name="_Toc244262014"/>
       <w:r>
         <w:rPr>
           <w:sz w:val="22"/>
@@ -8322,7 +8377,13 @@
         </w:tabs>
       </w:pPr>
       <w:r>
-        <w:t>Quelle. Eigene Darstellung</w:t>
+        <w:t>Quelle</w:t>
+      </w:r>
+      <w:r>
+        <w:t>:</w:t>
+      </w:r>
+      <w:r>
+        <w:t xml:space="preserve"> Eigene Darstellung</w:t>
       </w:r>
     </w:p>
     <w:p/>
@@ -14575,6 +14636,7 @@
   <w:style w:type="character" w:default="1" w:styleId="Absatz-Standardschriftart">
     <w:name w:val="Default Paragraph Font"/>
     <w:uiPriority w:val="1"/>
+    <w:semiHidden/>
     <w:unhideWhenUsed/>
   </w:style>
   <w:style w:type="table" w:default="1" w:styleId="NormaleTabelle">

</xml_diff>